<commit_message>
Add Word document and .gitignore file
</commit_message>
<xml_diff>
--- a/docs/Отчёт_ЛР_№1_Нелин_ТАУ_Шоглин_ММ_СМ11-61Б.docx
+++ b/docs/Отчёт_ЛР_№1_Нелин_ТАУ_Шоглин_ММ_СМ11-61Б.docx
@@ -10901,10 +10901,10 @@
           <w:noProof/>
         </w:rPr>
         <w:drawing>
-          <wp:inline distT="0" distB="0" distL="0" distR="0" wp14:anchorId="6A3D2426" wp14:editId="43A5E02A">
-            <wp:extent cx="6092581" cy="2953802"/>
+          <wp:inline distT="0" distB="0" distL="0" distR="0" wp14:anchorId="5041973D" wp14:editId="07060E70">
+            <wp:extent cx="5939790" cy="5742305"/>
             <wp:effectExtent l="0" t="0" r="3810" b="0"/>
-            <wp:docPr id="1909941587" name="Рисунок 1"/>
+            <wp:docPr id="349535577" name="Рисунок 1"/>
             <wp:cNvGraphicFramePr>
               <a:graphicFrameLocks xmlns:a="http://schemas.openxmlformats.org/drawingml/2006/main" noChangeAspect="1"/>
             </wp:cNvGraphicFramePr>
@@ -10912,7 +10912,7 @@
               <a:graphicData uri="http://schemas.openxmlformats.org/drawingml/2006/picture">
                 <pic:pic xmlns:pic="http://schemas.openxmlformats.org/drawingml/2006/picture">
                   <pic:nvPicPr>
-                    <pic:cNvPr id="1909941587" name=""/>
+                    <pic:cNvPr id="349535577" name=""/>
                     <pic:cNvPicPr/>
                   </pic:nvPicPr>
                   <pic:blipFill>
@@ -10924,7 +10924,7 @@
                   <pic:spPr>
                     <a:xfrm>
                       <a:off x="0" y="0"/>
-                      <a:ext cx="6131419" cy="2972632"/>
+                      <a:ext cx="5939790" cy="5742305"/>
                     </a:xfrm>
                     <a:prstGeom prst="rect">
                       <a:avLst/>
@@ -10958,6 +10958,7 @@
           <w:sz w:val="28"/>
           <w:szCs w:val="28"/>
         </w:rPr>
+        <w:lastRenderedPageBreak/>
         <w:t xml:space="preserve">Рисунок </w:t>
       </w:r>
       <w:r>
@@ -11126,6 +11127,187 @@
     <w:p>
       <w:pPr>
         <w:spacing w:line="360" w:lineRule="auto"/>
+        <w:mirrorIndents/>
+        <w:rPr>
+          <w:rFonts w:ascii="Times New Roman" w:hAnsi="Times New Roman" w:cs="Times New Roman"/>
+          <w:bCs/>
+          <w:sz w:val="28"/>
+          <w:szCs w:val="28"/>
+        </w:rPr>
+      </w:pPr>
+      <w:r>
+        <w:rPr>
+          <w:noProof/>
+        </w:rPr>
+        <w:drawing>
+          <wp:inline distT="0" distB="0" distL="0" distR="0" wp14:anchorId="34DC7243" wp14:editId="6E241E3B">
+            <wp:extent cx="5574030" cy="5438761"/>
+            <wp:effectExtent l="0" t="0" r="7620" b="0"/>
+            <wp:docPr id="129772471" name="Рисунок 1"/>
+            <wp:cNvGraphicFramePr>
+              <a:graphicFrameLocks xmlns:a="http://schemas.openxmlformats.org/drawingml/2006/main" noChangeAspect="1"/>
+            </wp:cNvGraphicFramePr>
+            <a:graphic xmlns:a="http://schemas.openxmlformats.org/drawingml/2006/main">
+              <a:graphicData uri="http://schemas.openxmlformats.org/drawingml/2006/picture">
+                <pic:pic xmlns:pic="http://schemas.openxmlformats.org/drawingml/2006/picture">
+                  <pic:nvPicPr>
+                    <pic:cNvPr id="129772471" name=""/>
+                    <pic:cNvPicPr/>
+                  </pic:nvPicPr>
+                  <pic:blipFill>
+                    <a:blip r:embed="rId18"/>
+                    <a:stretch>
+                      <a:fillRect/>
+                    </a:stretch>
+                  </pic:blipFill>
+                  <pic:spPr>
+                    <a:xfrm>
+                      <a:off x="0" y="0"/>
+                      <a:ext cx="5576978" cy="5441637"/>
+                    </a:xfrm>
+                    <a:prstGeom prst="rect">
+                      <a:avLst/>
+                    </a:prstGeom>
+                  </pic:spPr>
+                </pic:pic>
+              </a:graphicData>
+            </a:graphic>
+          </wp:inline>
+        </w:drawing>
+      </w:r>
+    </w:p>
+    <w:p>
+      <w:pPr>
+        <w:spacing w:line="360" w:lineRule="auto"/>
+        <w:ind w:firstLine="709"/>
+        <w:mirrorIndents/>
+        <w:jc w:val="both"/>
+        <w:rPr>
+          <w:rFonts w:ascii="Times New Roman" w:hAnsi="Times New Roman" w:cs="Times New Roman"/>
+          <w:bCs/>
+          <w:i/>
+          <w:sz w:val="28"/>
+          <w:szCs w:val="28"/>
+        </w:rPr>
+      </w:pPr>
+      <w:r>
+        <w:rPr>
+          <w:rFonts w:ascii="Times New Roman" w:hAnsi="Times New Roman" w:cs="Times New Roman"/>
+          <w:bCs/>
+          <w:sz w:val="28"/>
+          <w:szCs w:val="28"/>
+        </w:rPr>
+        <w:t xml:space="preserve">Рисунок </w:t>
+      </w:r>
+      <w:r>
+        <w:rPr>
+          <w:rFonts w:ascii="Times New Roman" w:hAnsi="Times New Roman" w:cs="Times New Roman"/>
+          <w:bCs/>
+          <w:sz w:val="28"/>
+          <w:szCs w:val="28"/>
+        </w:rPr>
+        <w:t>9</w:t>
+      </w:r>
+      <w:r>
+        <w:rPr>
+          <w:rFonts w:ascii="Times New Roman" w:hAnsi="Times New Roman" w:cs="Times New Roman"/>
+          <w:bCs/>
+          <w:sz w:val="28"/>
+          <w:szCs w:val="28"/>
+        </w:rPr>
+        <w:t xml:space="preserve"> – </w:t>
+      </w:r>
+      <w:r>
+        <w:rPr>
+          <w:rFonts w:ascii="Times New Roman" w:hAnsi="Times New Roman" w:cs="Times New Roman"/>
+          <w:bCs/>
+          <w:sz w:val="28"/>
+          <w:szCs w:val="28"/>
+        </w:rPr>
+        <w:t>Графики скорости вращения и угла поворота вала двигателя при 10 В на входе</w:t>
+      </w:r>
+      <w:r>
+        <w:rPr>
+          <w:rFonts w:ascii="Times New Roman" w:hAnsi="Times New Roman" w:cs="Times New Roman"/>
+          <w:bCs/>
+          <w:sz w:val="28"/>
+          <w:szCs w:val="28"/>
+        </w:rPr>
+        <w:t xml:space="preserve"> </w:t>
+      </w:r>
+      <w:r>
+        <w:rPr>
+          <w:rFonts w:ascii="Times New Roman" w:hAnsi="Times New Roman" w:cs="Times New Roman"/>
+          <w:bCs/>
+          <w:sz w:val="28"/>
+          <w:szCs w:val="28"/>
+        </w:rPr>
+        <w:t xml:space="preserve">и </w:t>
+      </w:r>
+      <w:r>
+        <w:rPr>
+          <w:rFonts w:ascii="Times New Roman" w:hAnsi="Times New Roman" w:cs="Times New Roman"/>
+          <w:bCs/>
+          <w:sz w:val="28"/>
+          <w:szCs w:val="28"/>
+        </w:rPr>
+        <w:t xml:space="preserve">при </w:t>
+      </w:r>
+      <m:oMath>
+        <m:r>
+          <w:rPr>
+            <w:rFonts w:ascii="Cambria Math" w:hAnsi="Cambria Math" w:cs="Times New Roman"/>
+            <w:sz w:val="28"/>
+            <w:szCs w:val="28"/>
+          </w:rPr>
+          <m:t>Мтр=</m:t>
+        </m:r>
+        <m:r>
+          <w:rPr>
+            <w:rFonts w:ascii="Cambria Math" w:hAnsi="Cambria Math" w:cs="Times New Roman"/>
+            <w:sz w:val="28"/>
+            <w:szCs w:val="28"/>
+            <w:lang w:val="en-US"/>
+          </w:rPr>
+          <m:t>β</m:t>
+        </m:r>
+        <m:r>
+          <w:rPr>
+            <w:rFonts w:ascii="Cambria Math" w:hAnsi="Cambria Math" w:cs="Times New Roman"/>
+            <w:sz w:val="28"/>
+            <w:szCs w:val="28"/>
+          </w:rPr>
+          <m:t>∙</m:t>
+        </m:r>
+        <m:acc>
+          <m:accPr>
+            <m:chr m:val="̇"/>
+            <m:ctrlPr>
+              <w:rPr>
+                <w:rFonts w:ascii="Cambria Math" w:hAnsi="Cambria Math" w:cs="Times New Roman"/>
+                <w:bCs/>
+                <w:i/>
+                <w:sz w:val="28"/>
+                <w:szCs w:val="28"/>
+              </w:rPr>
+            </m:ctrlPr>
+          </m:accPr>
+          <m:e>
+            <m:r>
+              <w:rPr>
+                <w:rFonts w:ascii="Cambria Math" w:hAnsi="Cambria Math" w:cs="Times New Roman"/>
+                <w:sz w:val="28"/>
+                <w:szCs w:val="28"/>
+              </w:rPr>
+              <m:t>φ</m:t>
+            </m:r>
+          </m:e>
+        </m:acc>
+      </m:oMath>
+    </w:p>
+    <w:p>
+      <w:pPr>
+        <w:spacing w:line="360" w:lineRule="auto"/>
         <w:ind w:firstLine="709"/>
         <w:mirrorIndents/>
         <w:jc w:val="both"/>
@@ -11170,7 +11352,7 @@
                     <pic:cNvPicPr/>
                   </pic:nvPicPr>
                   <pic:blipFill>
-                    <a:blip r:embed="rId18"/>
+                    <a:blip r:embed="rId19"/>
                     <a:stretch>
                       <a:fillRect/>
                     </a:stretch>
@@ -11221,7 +11403,7 @@
           <w:sz w:val="28"/>
           <w:szCs w:val="28"/>
         </w:rPr>
-        <w:t>9</w:t>
+        <w:t>10</w:t>
       </w:r>
       <w:r>
         <w:rPr>
@@ -11504,7 +11686,7 @@
                     <pic:cNvPicPr/>
                   </pic:nvPicPr>
                   <pic:blipFill>
-                    <a:blip r:embed="rId19"/>
+                    <a:blip r:embed="rId20"/>
                     <a:stretch>
                       <a:fillRect/>
                     </a:stretch>
@@ -11545,7 +11727,25 @@
           <w:sz w:val="28"/>
           <w:szCs w:val="28"/>
         </w:rPr>
-        <w:t>Рисунок 10 – Выполнение тестов</w:t>
+        <w:t>Рисунок 1</w:t>
+      </w:r>
+      <w:r>
+        <w:rPr>
+          <w:rFonts w:ascii="Times New Roman" w:hAnsi="Times New Roman" w:cs="Times New Roman"/>
+          <w:bCs/>
+          <w:sz w:val="28"/>
+          <w:szCs w:val="28"/>
+        </w:rPr>
+        <w:t>1</w:t>
+      </w:r>
+      <w:r>
+        <w:rPr>
+          <w:rFonts w:ascii="Times New Roman" w:hAnsi="Times New Roman" w:cs="Times New Roman"/>
+          <w:bCs/>
+          <w:sz w:val="28"/>
+          <w:szCs w:val="28"/>
+        </w:rPr>
+        <w:t xml:space="preserve"> – Выполнение тестов</w:t>
       </w:r>
     </w:p>
     <w:p>
@@ -11567,9 +11767,1161 @@
         <w:spacing w:line="360" w:lineRule="auto"/>
         <w:ind w:firstLine="709"/>
         <w:mirrorIndents/>
+        <w:jc w:val="center"/>
+        <w:rPr>
+          <w:rFonts w:ascii="Times New Roman" w:hAnsi="Times New Roman" w:cs="Times New Roman"/>
+          <w:bCs/>
+          <w:sz w:val="28"/>
+          <w:szCs w:val="28"/>
+        </w:rPr>
+      </w:pPr>
+    </w:p>
+    <w:p>
+      <w:pPr>
+        <w:spacing w:line="360" w:lineRule="auto"/>
+        <w:ind w:firstLine="709"/>
+        <w:mirrorIndents/>
+        <w:jc w:val="center"/>
+        <w:rPr>
+          <w:rFonts w:ascii="Times New Roman" w:hAnsi="Times New Roman" w:cs="Times New Roman"/>
+          <w:bCs/>
+          <w:sz w:val="28"/>
+          <w:szCs w:val="28"/>
+        </w:rPr>
+      </w:pPr>
+    </w:p>
+    <w:p>
+      <w:pPr>
+        <w:spacing w:line="360" w:lineRule="auto"/>
+        <w:ind w:firstLine="709"/>
+        <w:mirrorIndents/>
+        <w:jc w:val="center"/>
+        <w:rPr>
+          <w:rFonts w:ascii="Times New Roman" w:hAnsi="Times New Roman" w:cs="Times New Roman"/>
+          <w:bCs/>
+          <w:sz w:val="28"/>
+          <w:szCs w:val="28"/>
+        </w:rPr>
+      </w:pPr>
+    </w:p>
+    <w:p>
+      <w:pPr>
+        <w:spacing w:line="360" w:lineRule="auto"/>
+        <w:ind w:firstLine="709"/>
+        <w:mirrorIndents/>
+        <w:jc w:val="center"/>
+        <w:rPr>
+          <w:rFonts w:ascii="Times New Roman" w:hAnsi="Times New Roman" w:cs="Times New Roman"/>
+          <w:bCs/>
+          <w:sz w:val="28"/>
+          <w:szCs w:val="28"/>
+        </w:rPr>
+      </w:pPr>
+    </w:p>
+    <w:p>
+      <w:pPr>
+        <w:spacing w:line="360" w:lineRule="auto"/>
+        <w:ind w:firstLine="709"/>
+        <w:mirrorIndents/>
+        <w:jc w:val="center"/>
+        <w:rPr>
+          <w:rFonts w:ascii="Times New Roman" w:hAnsi="Times New Roman" w:cs="Times New Roman"/>
+          <w:bCs/>
+          <w:sz w:val="28"/>
+          <w:szCs w:val="28"/>
+        </w:rPr>
+      </w:pPr>
+    </w:p>
+    <w:p>
+      <w:pPr>
+        <w:spacing w:line="360" w:lineRule="auto"/>
+        <w:ind w:firstLine="709"/>
+        <w:mirrorIndents/>
+        <w:jc w:val="center"/>
+        <w:rPr>
+          <w:rFonts w:ascii="Times New Roman" w:hAnsi="Times New Roman" w:cs="Times New Roman"/>
+          <w:bCs/>
+          <w:sz w:val="28"/>
+          <w:szCs w:val="28"/>
+        </w:rPr>
+      </w:pPr>
+      <w:r>
+        <w:rPr>
+          <w:rFonts w:ascii="Times New Roman" w:hAnsi="Times New Roman" w:cs="Times New Roman"/>
+          <w:bCs/>
+          <w:sz w:val="28"/>
+          <w:szCs w:val="28"/>
+        </w:rPr>
+        <w:lastRenderedPageBreak/>
+        <w:t>КАК Я ВЁЛ СВЛЙ ПРОЕКТ НА ГИТ</w:t>
+      </w:r>
+    </w:p>
+    <w:p>
+      <w:pPr>
+        <w:spacing w:line="360" w:lineRule="auto"/>
+        <w:ind w:firstLine="709"/>
+        <w:mirrorIndents/>
+        <w:jc w:val="center"/>
+        <w:rPr>
+          <w:rFonts w:ascii="Times New Roman" w:hAnsi="Times New Roman" w:cs="Times New Roman"/>
+          <w:bCs/>
+          <w:sz w:val="28"/>
+          <w:szCs w:val="28"/>
+        </w:rPr>
+      </w:pPr>
+    </w:p>
+    <w:tbl>
+      <w:tblPr>
+        <w:tblStyle w:val="af4"/>
+        <w:tblW w:w="0" w:type="auto"/>
+        <w:tblLook w:val="04A0" w:firstRow="1" w:lastRow="0" w:firstColumn="1" w:lastColumn="0" w:noHBand="0" w:noVBand="1"/>
+      </w:tblPr>
+      <w:tblGrid>
+        <w:gridCol w:w="9344"/>
+      </w:tblGrid>
+      <w:tr>
+        <w:tc>
+          <w:tcPr>
+            <w:tcW w:w="9344" w:type="dxa"/>
+          </w:tcPr>
+          <w:p>
+            <w:pPr>
+              <w:spacing w:line="360" w:lineRule="auto"/>
+              <w:mirrorIndents/>
+              <w:rPr>
+                <w:rFonts w:ascii="Consolas" w:hAnsi="Consolas" w:cs="Times New Roman"/>
+                <w:bCs/>
+                <w:sz w:val="28"/>
+                <w:szCs w:val="28"/>
+              </w:rPr>
+            </w:pPr>
+            <w:r>
+              <w:rPr>
+                <w:rFonts w:ascii="Consolas" w:hAnsi="Consolas" w:cs="Times New Roman"/>
+                <w:bCs/>
+                <w:sz w:val="28"/>
+                <w:szCs w:val="28"/>
+              </w:rPr>
+              <w:t># Клонирование репозитория</w:t>
+            </w:r>
+          </w:p>
+          <w:p>
+            <w:pPr>
+              <w:spacing w:line="360" w:lineRule="auto"/>
+              <w:mirrorIndents/>
+              <w:rPr>
+                <w:rFonts w:ascii="Consolas" w:hAnsi="Consolas" w:cs="Times New Roman"/>
+                <w:bCs/>
+                <w:sz w:val="28"/>
+                <w:szCs w:val="28"/>
+              </w:rPr>
+            </w:pPr>
+            <w:proofErr w:type="spellStart"/>
+            <w:r>
+              <w:rPr>
+                <w:rFonts w:ascii="Consolas" w:hAnsi="Consolas" w:cs="Times New Roman"/>
+                <w:bCs/>
+                <w:sz w:val="28"/>
+                <w:szCs w:val="28"/>
+              </w:rPr>
+              <w:t>git</w:t>
+            </w:r>
+            <w:proofErr w:type="spellEnd"/>
+            <w:r>
+              <w:rPr>
+                <w:rFonts w:ascii="Consolas" w:hAnsi="Consolas" w:cs="Times New Roman"/>
+                <w:bCs/>
+                <w:sz w:val="28"/>
+                <w:szCs w:val="28"/>
+              </w:rPr>
+              <w:t xml:space="preserve"> </w:t>
+            </w:r>
+            <w:proofErr w:type="spellStart"/>
+            <w:r>
+              <w:rPr>
+                <w:rFonts w:ascii="Consolas" w:hAnsi="Consolas" w:cs="Times New Roman"/>
+                <w:bCs/>
+                <w:sz w:val="28"/>
+                <w:szCs w:val="28"/>
+              </w:rPr>
+              <w:t>clone</w:t>
+            </w:r>
+            <w:proofErr w:type="spellEnd"/>
+            <w:r>
+              <w:rPr>
+                <w:rFonts w:ascii="Consolas" w:hAnsi="Consolas" w:cs="Times New Roman"/>
+                <w:bCs/>
+                <w:sz w:val="28"/>
+                <w:szCs w:val="28"/>
+              </w:rPr>
+              <w:t xml:space="preserve"> https://github.com/shoglin/DC_motor.git</w:t>
+            </w:r>
+          </w:p>
+          <w:p>
+            <w:pPr>
+              <w:spacing w:line="360" w:lineRule="auto"/>
+              <w:mirrorIndents/>
+              <w:rPr>
+                <w:rFonts w:ascii="Consolas" w:hAnsi="Consolas" w:cs="Times New Roman"/>
+                <w:bCs/>
+                <w:sz w:val="28"/>
+                <w:szCs w:val="28"/>
+              </w:rPr>
+            </w:pPr>
+          </w:p>
+          <w:p>
+            <w:pPr>
+              <w:spacing w:line="360" w:lineRule="auto"/>
+              <w:mirrorIndents/>
+              <w:rPr>
+                <w:rFonts w:ascii="Consolas" w:hAnsi="Consolas" w:cs="Times New Roman"/>
+                <w:bCs/>
+                <w:sz w:val="28"/>
+                <w:szCs w:val="28"/>
+                <w:lang w:val="en-US"/>
+              </w:rPr>
+            </w:pPr>
+            <w:r>
+              <w:rPr>
+                <w:rFonts w:ascii="Consolas" w:hAnsi="Consolas" w:cs="Times New Roman"/>
+                <w:bCs/>
+                <w:sz w:val="28"/>
+                <w:szCs w:val="28"/>
+                <w:lang w:val="en-US"/>
+              </w:rPr>
+              <w:t xml:space="preserve"># </w:t>
+            </w:r>
+            <w:r>
+              <w:rPr>
+                <w:rFonts w:ascii="Consolas" w:hAnsi="Consolas" w:cs="Times New Roman"/>
+                <w:bCs/>
+                <w:sz w:val="28"/>
+                <w:szCs w:val="28"/>
+              </w:rPr>
+              <w:t>Создание</w:t>
+            </w:r>
+            <w:r>
+              <w:rPr>
+                <w:rFonts w:ascii="Consolas" w:hAnsi="Consolas" w:cs="Times New Roman"/>
+                <w:bCs/>
+                <w:sz w:val="28"/>
+                <w:szCs w:val="28"/>
+                <w:lang w:val="en-US"/>
+              </w:rPr>
+              <w:t xml:space="preserve"> </w:t>
+            </w:r>
+            <w:r>
+              <w:rPr>
+                <w:rFonts w:ascii="Consolas" w:hAnsi="Consolas" w:cs="Times New Roman"/>
+                <w:bCs/>
+                <w:sz w:val="28"/>
+                <w:szCs w:val="28"/>
+              </w:rPr>
+              <w:t>веток</w:t>
+            </w:r>
+          </w:p>
+          <w:p>
+            <w:pPr>
+              <w:spacing w:line="360" w:lineRule="auto"/>
+              <w:mirrorIndents/>
+              <w:rPr>
+                <w:rFonts w:ascii="Consolas" w:hAnsi="Consolas" w:cs="Times New Roman"/>
+                <w:bCs/>
+                <w:sz w:val="28"/>
+                <w:szCs w:val="28"/>
+                <w:lang w:val="en-US"/>
+              </w:rPr>
+            </w:pPr>
+            <w:r>
+              <w:rPr>
+                <w:rFonts w:ascii="Consolas" w:hAnsi="Consolas" w:cs="Times New Roman"/>
+                <w:bCs/>
+                <w:sz w:val="28"/>
+                <w:szCs w:val="28"/>
+                <w:lang w:val="en-US"/>
+              </w:rPr>
+              <w:t>git branch dev</w:t>
+            </w:r>
+          </w:p>
+          <w:p>
+            <w:pPr>
+              <w:spacing w:line="360" w:lineRule="auto"/>
+              <w:mirrorIndents/>
+              <w:rPr>
+                <w:rFonts w:ascii="Consolas" w:hAnsi="Consolas" w:cs="Times New Roman"/>
+                <w:bCs/>
+                <w:sz w:val="28"/>
+                <w:szCs w:val="28"/>
+                <w:lang w:val="en-US"/>
+              </w:rPr>
+            </w:pPr>
+            <w:r>
+              <w:rPr>
+                <w:rFonts w:ascii="Consolas" w:hAnsi="Consolas" w:cs="Times New Roman"/>
+                <w:bCs/>
+                <w:sz w:val="28"/>
+                <w:szCs w:val="28"/>
+                <w:lang w:val="en-US"/>
+              </w:rPr>
+              <w:t>git checkout -b feature-</w:t>
+            </w:r>
+            <w:proofErr w:type="spellStart"/>
+            <w:r>
+              <w:rPr>
+                <w:rFonts w:ascii="Consolas" w:hAnsi="Consolas" w:cs="Times New Roman"/>
+                <w:bCs/>
+                <w:sz w:val="28"/>
+                <w:szCs w:val="28"/>
+                <w:lang w:val="en-US"/>
+              </w:rPr>
+              <w:t>viscous_friction</w:t>
+            </w:r>
+            <w:proofErr w:type="spellEnd"/>
+          </w:p>
+          <w:p>
+            <w:pPr>
+              <w:spacing w:line="360" w:lineRule="auto"/>
+              <w:mirrorIndents/>
+              <w:rPr>
+                <w:rFonts w:ascii="Consolas" w:hAnsi="Consolas" w:cs="Times New Roman"/>
+                <w:bCs/>
+                <w:sz w:val="28"/>
+                <w:szCs w:val="28"/>
+                <w:lang w:val="en-US"/>
+              </w:rPr>
+            </w:pPr>
+          </w:p>
+          <w:p>
+            <w:pPr>
+              <w:spacing w:line="360" w:lineRule="auto"/>
+              <w:mirrorIndents/>
+              <w:rPr>
+                <w:rFonts w:ascii="Consolas" w:hAnsi="Consolas" w:cs="Times New Roman"/>
+                <w:bCs/>
+                <w:sz w:val="28"/>
+                <w:szCs w:val="28"/>
+                <w:lang w:val="en-US"/>
+              </w:rPr>
+            </w:pPr>
+            <w:r>
+              <w:rPr>
+                <w:rFonts w:ascii="Consolas" w:hAnsi="Consolas" w:cs="Times New Roman"/>
+                <w:bCs/>
+                <w:sz w:val="28"/>
+                <w:szCs w:val="28"/>
+                <w:lang w:val="en-US"/>
+              </w:rPr>
+              <w:t xml:space="preserve"># </w:t>
+            </w:r>
+            <w:r>
+              <w:rPr>
+                <w:rFonts w:ascii="Consolas" w:hAnsi="Consolas" w:cs="Times New Roman"/>
+                <w:bCs/>
+                <w:sz w:val="28"/>
+                <w:szCs w:val="28"/>
+              </w:rPr>
+              <w:t>Слияние</w:t>
+            </w:r>
+            <w:r>
+              <w:rPr>
+                <w:rFonts w:ascii="Consolas" w:hAnsi="Consolas" w:cs="Times New Roman"/>
+                <w:bCs/>
+                <w:sz w:val="28"/>
+                <w:szCs w:val="28"/>
+                <w:lang w:val="en-US"/>
+              </w:rPr>
+              <w:t xml:space="preserve"> </w:t>
+            </w:r>
+            <w:r>
+              <w:rPr>
+                <w:rFonts w:ascii="Consolas" w:hAnsi="Consolas" w:cs="Times New Roman"/>
+                <w:bCs/>
+                <w:sz w:val="28"/>
+                <w:szCs w:val="28"/>
+              </w:rPr>
+              <w:t>изменений</w:t>
+            </w:r>
+          </w:p>
+          <w:p>
+            <w:pPr>
+              <w:spacing w:line="360" w:lineRule="auto"/>
+              <w:mirrorIndents/>
+              <w:rPr>
+                <w:rFonts w:ascii="Consolas" w:hAnsi="Consolas" w:cs="Times New Roman"/>
+                <w:bCs/>
+                <w:sz w:val="28"/>
+                <w:szCs w:val="28"/>
+                <w:lang w:val="en-US"/>
+              </w:rPr>
+            </w:pPr>
+            <w:r>
+              <w:rPr>
+                <w:rFonts w:ascii="Consolas" w:hAnsi="Consolas" w:cs="Times New Roman"/>
+                <w:bCs/>
+                <w:sz w:val="28"/>
+                <w:szCs w:val="28"/>
+                <w:lang w:val="en-US"/>
+              </w:rPr>
+              <w:t>git checkout dev</w:t>
+            </w:r>
+          </w:p>
+          <w:p>
+            <w:pPr>
+              <w:spacing w:line="360" w:lineRule="auto"/>
+              <w:mirrorIndents/>
+              <w:rPr>
+                <w:rFonts w:ascii="Consolas" w:hAnsi="Consolas" w:cs="Times New Roman"/>
+                <w:bCs/>
+                <w:sz w:val="28"/>
+                <w:szCs w:val="28"/>
+                <w:lang w:val="en-US"/>
+              </w:rPr>
+            </w:pPr>
+            <w:r>
+              <w:rPr>
+                <w:rFonts w:ascii="Consolas" w:hAnsi="Consolas" w:cs="Times New Roman"/>
+                <w:bCs/>
+                <w:sz w:val="28"/>
+                <w:szCs w:val="28"/>
+                <w:lang w:val="en-US"/>
+              </w:rPr>
+              <w:t>git merge feature-</w:t>
+            </w:r>
+            <w:proofErr w:type="spellStart"/>
+            <w:r>
+              <w:rPr>
+                <w:rFonts w:ascii="Consolas" w:hAnsi="Consolas" w:cs="Times New Roman"/>
+                <w:bCs/>
+                <w:sz w:val="28"/>
+                <w:szCs w:val="28"/>
+                <w:lang w:val="en-US"/>
+              </w:rPr>
+              <w:t>viscous_friction</w:t>
+            </w:r>
+            <w:proofErr w:type="spellEnd"/>
+          </w:p>
+          <w:p>
+            <w:pPr>
+              <w:spacing w:line="360" w:lineRule="auto"/>
+              <w:mirrorIndents/>
+              <w:rPr>
+                <w:rFonts w:ascii="Consolas" w:hAnsi="Consolas" w:cs="Times New Roman"/>
+                <w:bCs/>
+                <w:sz w:val="28"/>
+                <w:szCs w:val="28"/>
+                <w:lang w:val="en-US"/>
+              </w:rPr>
+            </w:pPr>
+          </w:p>
+          <w:p>
+            <w:pPr>
+              <w:spacing w:line="360" w:lineRule="auto"/>
+              <w:mirrorIndents/>
+              <w:rPr>
+                <w:rFonts w:ascii="Consolas" w:hAnsi="Consolas" w:cs="Times New Roman"/>
+                <w:bCs/>
+                <w:sz w:val="28"/>
+                <w:szCs w:val="28"/>
+                <w:lang w:val="en-US"/>
+              </w:rPr>
+            </w:pPr>
+            <w:r>
+              <w:rPr>
+                <w:rFonts w:ascii="Consolas" w:hAnsi="Consolas" w:cs="Times New Roman"/>
+                <w:bCs/>
+                <w:sz w:val="28"/>
+                <w:szCs w:val="28"/>
+                <w:lang w:val="en-US"/>
+              </w:rPr>
+              <w:t xml:space="preserve"># </w:t>
+            </w:r>
+            <w:r>
+              <w:rPr>
+                <w:rFonts w:ascii="Consolas" w:hAnsi="Consolas" w:cs="Times New Roman"/>
+                <w:bCs/>
+                <w:sz w:val="28"/>
+                <w:szCs w:val="28"/>
+              </w:rPr>
+              <w:t>Отправка</w:t>
+            </w:r>
+            <w:r>
+              <w:rPr>
+                <w:rFonts w:ascii="Consolas" w:hAnsi="Consolas" w:cs="Times New Roman"/>
+                <w:bCs/>
+                <w:sz w:val="28"/>
+                <w:szCs w:val="28"/>
+                <w:lang w:val="en-US"/>
+              </w:rPr>
+              <w:t xml:space="preserve"> </w:t>
+            </w:r>
+            <w:r>
+              <w:rPr>
+                <w:rFonts w:ascii="Consolas" w:hAnsi="Consolas" w:cs="Times New Roman"/>
+                <w:bCs/>
+                <w:sz w:val="28"/>
+                <w:szCs w:val="28"/>
+              </w:rPr>
+              <w:t>на</w:t>
+            </w:r>
+            <w:r>
+              <w:rPr>
+                <w:rFonts w:ascii="Consolas" w:hAnsi="Consolas" w:cs="Times New Roman"/>
+                <w:bCs/>
+                <w:sz w:val="28"/>
+                <w:szCs w:val="28"/>
+                <w:lang w:val="en-US"/>
+              </w:rPr>
+              <w:t xml:space="preserve"> GitHub</w:t>
+            </w:r>
+          </w:p>
+          <w:p>
+            <w:pPr>
+              <w:spacing w:line="360" w:lineRule="auto"/>
+              <w:mirrorIndents/>
+              <w:rPr>
+                <w:rFonts w:ascii="Consolas" w:hAnsi="Consolas" w:cs="Times New Roman"/>
+                <w:bCs/>
+                <w:sz w:val="28"/>
+                <w:szCs w:val="28"/>
+                <w:lang w:val="en-US"/>
+              </w:rPr>
+            </w:pPr>
+            <w:r>
+              <w:rPr>
+                <w:rFonts w:ascii="Consolas" w:hAnsi="Consolas" w:cs="Times New Roman"/>
+                <w:bCs/>
+                <w:sz w:val="28"/>
+                <w:szCs w:val="28"/>
+                <w:lang w:val="en-US"/>
+              </w:rPr>
+              <w:t>git push -u origin dev</w:t>
+            </w:r>
+          </w:p>
+          <w:p>
+            <w:pPr>
+              <w:spacing w:line="360" w:lineRule="auto"/>
+              <w:mirrorIndents/>
+              <w:rPr>
+                <w:rFonts w:ascii="Times New Roman" w:hAnsi="Times New Roman" w:cs="Times New Roman"/>
+                <w:bCs/>
+                <w:sz w:val="28"/>
+                <w:szCs w:val="28"/>
+                <w:lang w:val="en-US"/>
+              </w:rPr>
+            </w:pPr>
+            <w:r>
+              <w:rPr>
+                <w:rFonts w:ascii="Consolas" w:hAnsi="Consolas" w:cs="Times New Roman"/>
+                <w:bCs/>
+                <w:sz w:val="28"/>
+                <w:szCs w:val="28"/>
+                <w:lang w:val="en-US"/>
+              </w:rPr>
+              <w:t>git push -u origin feature-</w:t>
+            </w:r>
+            <w:proofErr w:type="spellStart"/>
+            <w:r>
+              <w:rPr>
+                <w:rFonts w:ascii="Consolas" w:hAnsi="Consolas" w:cs="Times New Roman"/>
+                <w:bCs/>
+                <w:sz w:val="28"/>
+                <w:szCs w:val="28"/>
+                <w:lang w:val="en-US"/>
+              </w:rPr>
+              <w:t>viscous_friction</w:t>
+            </w:r>
+            <w:proofErr w:type="spellEnd"/>
+          </w:p>
+        </w:tc>
+      </w:tr>
+    </w:tbl>
+    <w:p>
+      <w:pPr>
+        <w:spacing w:line="360" w:lineRule="auto"/>
+        <w:ind w:firstLine="709"/>
+        <w:mirrorIndents/>
+        <w:jc w:val="center"/>
+        <w:rPr>
+          <w:rFonts w:ascii="Times New Roman" w:hAnsi="Times New Roman" w:cs="Times New Roman"/>
+          <w:sz w:val="28"/>
+          <w:szCs w:val="28"/>
+          <w:lang w:val="en-US"/>
+        </w:rPr>
+      </w:pPr>
+    </w:p>
+    <w:p>
+      <w:pPr>
+        <w:spacing w:line="360" w:lineRule="auto"/>
+        <w:ind w:firstLine="709"/>
+        <w:mirrorIndents/>
         <w:jc w:val="both"/>
         <w:rPr>
           <w:rFonts w:ascii="Times New Roman" w:hAnsi="Times New Roman" w:cs="Times New Roman"/>
+          <w:sz w:val="28"/>
+          <w:szCs w:val="28"/>
+        </w:rPr>
+      </w:pPr>
+      <w:r>
+        <w:rPr>
+          <w:rFonts w:ascii="Times New Roman" w:hAnsi="Times New Roman" w:cs="Times New Roman"/>
+          <w:sz w:val="28"/>
+          <w:szCs w:val="28"/>
+        </w:rPr>
+        <w:t>Процесс работы:</w:t>
+      </w:r>
+    </w:p>
+    <w:p>
+      <w:pPr>
+        <w:numPr>
+          <w:ilvl w:val="0"/>
+          <w:numId w:val="5"/>
+        </w:numPr>
+        <w:spacing w:line="360" w:lineRule="auto"/>
+        <w:ind w:left="0" w:firstLine="709"/>
+        <w:mirrorIndents/>
+        <w:jc w:val="both"/>
+        <w:rPr>
+          <w:rFonts w:ascii="Times New Roman" w:hAnsi="Times New Roman" w:cs="Times New Roman"/>
+          <w:bCs/>
+          <w:sz w:val="28"/>
+          <w:szCs w:val="28"/>
+        </w:rPr>
+      </w:pPr>
+      <w:r>
+        <w:rPr>
+          <w:rFonts w:ascii="Times New Roman" w:hAnsi="Times New Roman" w:cs="Times New Roman"/>
+          <w:bCs/>
+          <w:sz w:val="28"/>
+          <w:szCs w:val="28"/>
+        </w:rPr>
+        <w:t>После создания репозитория и клонирования его в папку с проектом с</w:t>
+      </w:r>
+      <w:r>
+        <w:rPr>
+          <w:rFonts w:ascii="Times New Roman" w:hAnsi="Times New Roman" w:cs="Times New Roman"/>
+          <w:bCs/>
+          <w:sz w:val="28"/>
+          <w:szCs w:val="28"/>
+        </w:rPr>
+        <w:t xml:space="preserve">оздан </w:t>
+      </w:r>
+      <w:proofErr w:type="spellStart"/>
+      <w:r>
+        <w:rPr>
+          <w:rFonts w:ascii="Times New Roman" w:hAnsi="Times New Roman" w:cs="Times New Roman"/>
+          <w:bCs/>
+          <w:sz w:val="28"/>
+          <w:szCs w:val="28"/>
+        </w:rPr>
+        <w:t>initial</w:t>
+      </w:r>
+      <w:proofErr w:type="spellEnd"/>
+      <w:r>
+        <w:rPr>
+          <w:rFonts w:ascii="Times New Roman" w:hAnsi="Times New Roman" w:cs="Times New Roman"/>
+          <w:bCs/>
+          <w:sz w:val="28"/>
+          <w:szCs w:val="28"/>
+        </w:rPr>
+        <w:t xml:space="preserve"> </w:t>
+      </w:r>
+      <w:proofErr w:type="spellStart"/>
+      <w:r>
+        <w:rPr>
+          <w:rFonts w:ascii="Times New Roman" w:hAnsi="Times New Roman" w:cs="Times New Roman"/>
+          <w:bCs/>
+          <w:sz w:val="28"/>
+          <w:szCs w:val="28"/>
+        </w:rPr>
+        <w:t>commit</w:t>
+      </w:r>
+      <w:proofErr w:type="spellEnd"/>
+      <w:r>
+        <w:rPr>
+          <w:rFonts w:ascii="Times New Roman" w:hAnsi="Times New Roman" w:cs="Times New Roman"/>
+          <w:bCs/>
+          <w:sz w:val="28"/>
+          <w:szCs w:val="28"/>
+        </w:rPr>
+        <w:t xml:space="preserve"> с базовой структурой проекта</w:t>
+      </w:r>
+    </w:p>
+    <w:p>
+      <w:pPr>
+        <w:numPr>
+          <w:ilvl w:val="0"/>
+          <w:numId w:val="5"/>
+        </w:numPr>
+        <w:spacing w:line="360" w:lineRule="auto"/>
+        <w:ind w:left="0" w:firstLine="709"/>
+        <w:mirrorIndents/>
+        <w:jc w:val="both"/>
+        <w:rPr>
+          <w:rFonts w:ascii="Times New Roman" w:hAnsi="Times New Roman" w:cs="Times New Roman"/>
+          <w:bCs/>
+          <w:sz w:val="28"/>
+          <w:szCs w:val="28"/>
+        </w:rPr>
+      </w:pPr>
+      <w:r>
+        <w:rPr>
+          <w:rFonts w:ascii="Times New Roman" w:hAnsi="Times New Roman" w:cs="Times New Roman"/>
+          <w:bCs/>
+          <w:sz w:val="28"/>
+          <w:szCs w:val="28"/>
+        </w:rPr>
+        <w:t xml:space="preserve">Выполнены пункты 1 и 2 (модель без трения) → коммит в </w:t>
+      </w:r>
+      <w:proofErr w:type="spellStart"/>
+      <w:r>
+        <w:rPr>
+          <w:rFonts w:ascii="Times New Roman" w:hAnsi="Times New Roman" w:cs="Times New Roman"/>
+          <w:bCs/>
+          <w:sz w:val="28"/>
+          <w:szCs w:val="28"/>
+        </w:rPr>
+        <w:t>dev</w:t>
+      </w:r>
+      <w:proofErr w:type="spellEnd"/>
+    </w:p>
+    <w:p>
+      <w:pPr>
+        <w:numPr>
+          <w:ilvl w:val="0"/>
+          <w:numId w:val="5"/>
+        </w:numPr>
+        <w:spacing w:line="360" w:lineRule="auto"/>
+        <w:ind w:left="0" w:firstLine="709"/>
+        <w:mirrorIndents/>
+        <w:jc w:val="both"/>
+        <w:rPr>
+          <w:rFonts w:ascii="Times New Roman" w:hAnsi="Times New Roman" w:cs="Times New Roman"/>
+          <w:bCs/>
+          <w:sz w:val="28"/>
+          <w:szCs w:val="28"/>
+          <w:lang w:val="en-US"/>
+        </w:rPr>
+      </w:pPr>
+      <w:r>
+        <w:rPr>
+          <w:rFonts w:ascii="Times New Roman" w:hAnsi="Times New Roman" w:cs="Times New Roman"/>
+          <w:bCs/>
+          <w:sz w:val="28"/>
+          <w:szCs w:val="28"/>
+        </w:rPr>
+        <w:t>Создана</w:t>
+      </w:r>
+      <w:r>
+        <w:rPr>
+          <w:rFonts w:ascii="Times New Roman" w:hAnsi="Times New Roman" w:cs="Times New Roman"/>
+          <w:bCs/>
+          <w:sz w:val="28"/>
+          <w:szCs w:val="28"/>
+          <w:lang w:val="en-US"/>
+        </w:rPr>
+        <w:t xml:space="preserve"> </w:t>
+      </w:r>
+      <w:r>
+        <w:rPr>
+          <w:rFonts w:ascii="Times New Roman" w:hAnsi="Times New Roman" w:cs="Times New Roman"/>
+          <w:bCs/>
+          <w:sz w:val="28"/>
+          <w:szCs w:val="28"/>
+        </w:rPr>
+        <w:t>ветка</w:t>
+      </w:r>
+      <w:r>
+        <w:rPr>
+          <w:rFonts w:ascii="Times New Roman" w:hAnsi="Times New Roman" w:cs="Times New Roman"/>
+          <w:bCs/>
+          <w:sz w:val="28"/>
+          <w:szCs w:val="28"/>
+          <w:lang w:val="en-US"/>
+        </w:rPr>
+        <w:t xml:space="preserve"> feature-</w:t>
+      </w:r>
+      <w:proofErr w:type="spellStart"/>
+      <w:r>
+        <w:rPr>
+          <w:rFonts w:ascii="Times New Roman" w:hAnsi="Times New Roman" w:cs="Times New Roman"/>
+          <w:bCs/>
+          <w:sz w:val="28"/>
+          <w:szCs w:val="28"/>
+          <w:lang w:val="en-US"/>
+        </w:rPr>
+        <w:t>viscous_friction</w:t>
+      </w:r>
+      <w:proofErr w:type="spellEnd"/>
+      <w:r>
+        <w:rPr>
+          <w:rFonts w:ascii="Times New Roman" w:hAnsi="Times New Roman" w:cs="Times New Roman"/>
+          <w:bCs/>
+          <w:sz w:val="28"/>
+          <w:szCs w:val="28"/>
+          <w:lang w:val="en-US"/>
+        </w:rPr>
+        <w:t xml:space="preserve"> </w:t>
+      </w:r>
+      <w:r>
+        <w:rPr>
+          <w:rFonts w:ascii="Times New Roman" w:hAnsi="Times New Roman" w:cs="Times New Roman"/>
+          <w:bCs/>
+          <w:sz w:val="28"/>
+          <w:szCs w:val="28"/>
+        </w:rPr>
+        <w:t>для</w:t>
+      </w:r>
+      <w:r>
+        <w:rPr>
+          <w:rFonts w:ascii="Times New Roman" w:hAnsi="Times New Roman" w:cs="Times New Roman"/>
+          <w:bCs/>
+          <w:sz w:val="28"/>
+          <w:szCs w:val="28"/>
+          <w:lang w:val="en-US"/>
+        </w:rPr>
+        <w:t xml:space="preserve"> </w:t>
+      </w:r>
+      <w:r>
+        <w:rPr>
+          <w:rFonts w:ascii="Times New Roman" w:hAnsi="Times New Roman" w:cs="Times New Roman"/>
+          <w:bCs/>
+          <w:sz w:val="28"/>
+          <w:szCs w:val="28"/>
+        </w:rPr>
+        <w:t>пункта</w:t>
+      </w:r>
+      <w:r>
+        <w:rPr>
+          <w:rFonts w:ascii="Times New Roman" w:hAnsi="Times New Roman" w:cs="Times New Roman"/>
+          <w:bCs/>
+          <w:sz w:val="28"/>
+          <w:szCs w:val="28"/>
+          <w:lang w:val="en-US"/>
+        </w:rPr>
+        <w:t xml:space="preserve"> 3</w:t>
+      </w:r>
+    </w:p>
+    <w:p>
+      <w:pPr>
+        <w:numPr>
+          <w:ilvl w:val="0"/>
+          <w:numId w:val="5"/>
+        </w:numPr>
+        <w:spacing w:line="360" w:lineRule="auto"/>
+        <w:ind w:left="0" w:firstLine="709"/>
+        <w:mirrorIndents/>
+        <w:jc w:val="both"/>
+        <w:rPr>
+          <w:rFonts w:ascii="Times New Roman" w:hAnsi="Times New Roman" w:cs="Times New Roman"/>
+          <w:bCs/>
+          <w:sz w:val="28"/>
+          <w:szCs w:val="28"/>
+          <w:lang w:val="en-US"/>
+        </w:rPr>
+      </w:pPr>
+      <w:r>
+        <w:rPr>
+          <w:rFonts w:ascii="Times New Roman" w:hAnsi="Times New Roman" w:cs="Times New Roman"/>
+          <w:bCs/>
+          <w:sz w:val="28"/>
+          <w:szCs w:val="28"/>
+        </w:rPr>
+        <w:t>Добавлено</w:t>
+      </w:r>
+      <w:r>
+        <w:rPr>
+          <w:rFonts w:ascii="Times New Roman" w:hAnsi="Times New Roman" w:cs="Times New Roman"/>
+          <w:bCs/>
+          <w:sz w:val="28"/>
+          <w:szCs w:val="28"/>
+          <w:lang w:val="en-US"/>
+        </w:rPr>
+        <w:t xml:space="preserve"> </w:t>
+      </w:r>
+      <w:r>
+        <w:rPr>
+          <w:rFonts w:ascii="Times New Roman" w:hAnsi="Times New Roman" w:cs="Times New Roman"/>
+          <w:bCs/>
+          <w:sz w:val="28"/>
+          <w:szCs w:val="28"/>
+        </w:rPr>
+        <w:t>вязкое</w:t>
+      </w:r>
+      <w:r>
+        <w:rPr>
+          <w:rFonts w:ascii="Times New Roman" w:hAnsi="Times New Roman" w:cs="Times New Roman"/>
+          <w:bCs/>
+          <w:sz w:val="28"/>
+          <w:szCs w:val="28"/>
+          <w:lang w:val="en-US"/>
+        </w:rPr>
+        <w:t xml:space="preserve"> </w:t>
+      </w:r>
+      <w:r>
+        <w:rPr>
+          <w:rFonts w:ascii="Times New Roman" w:hAnsi="Times New Roman" w:cs="Times New Roman"/>
+          <w:bCs/>
+          <w:sz w:val="28"/>
+          <w:szCs w:val="28"/>
+        </w:rPr>
+        <w:t>трение</w:t>
+      </w:r>
+      <w:r>
+        <w:rPr>
+          <w:rFonts w:ascii="Times New Roman" w:hAnsi="Times New Roman" w:cs="Times New Roman"/>
+          <w:bCs/>
+          <w:sz w:val="28"/>
+          <w:szCs w:val="28"/>
+          <w:lang w:val="en-US"/>
+        </w:rPr>
+        <w:t xml:space="preserve"> → </w:t>
+      </w:r>
+      <w:r>
+        <w:rPr>
+          <w:rFonts w:ascii="Times New Roman" w:hAnsi="Times New Roman" w:cs="Times New Roman"/>
+          <w:bCs/>
+          <w:sz w:val="28"/>
+          <w:szCs w:val="28"/>
+        </w:rPr>
+        <w:t>коммит</w:t>
+      </w:r>
+      <w:r>
+        <w:rPr>
+          <w:rFonts w:ascii="Times New Roman" w:hAnsi="Times New Roman" w:cs="Times New Roman"/>
+          <w:bCs/>
+          <w:sz w:val="28"/>
+          <w:szCs w:val="28"/>
+          <w:lang w:val="en-US"/>
+        </w:rPr>
+        <w:t xml:space="preserve"> </w:t>
+      </w:r>
+      <w:r>
+        <w:rPr>
+          <w:rFonts w:ascii="Times New Roman" w:hAnsi="Times New Roman" w:cs="Times New Roman"/>
+          <w:bCs/>
+          <w:sz w:val="28"/>
+          <w:szCs w:val="28"/>
+        </w:rPr>
+        <w:t>в</w:t>
+      </w:r>
+      <w:r>
+        <w:rPr>
+          <w:rFonts w:ascii="Times New Roman" w:hAnsi="Times New Roman" w:cs="Times New Roman"/>
+          <w:bCs/>
+          <w:sz w:val="28"/>
+          <w:szCs w:val="28"/>
+          <w:lang w:val="en-US"/>
+        </w:rPr>
+        <w:t xml:space="preserve"> feature-</w:t>
+      </w:r>
+      <w:proofErr w:type="spellStart"/>
+      <w:r>
+        <w:rPr>
+          <w:rFonts w:ascii="Times New Roman" w:hAnsi="Times New Roman" w:cs="Times New Roman"/>
+          <w:bCs/>
+          <w:sz w:val="28"/>
+          <w:szCs w:val="28"/>
+          <w:lang w:val="en-US"/>
+        </w:rPr>
+        <w:t>viscous_friction</w:t>
+      </w:r>
+      <w:proofErr w:type="spellEnd"/>
+    </w:p>
+    <w:p>
+      <w:pPr>
+        <w:numPr>
+          <w:ilvl w:val="0"/>
+          <w:numId w:val="5"/>
+        </w:numPr>
+        <w:spacing w:line="360" w:lineRule="auto"/>
+        <w:ind w:left="0" w:firstLine="709"/>
+        <w:mirrorIndents/>
+        <w:jc w:val="both"/>
+        <w:rPr>
+          <w:rFonts w:ascii="Times New Roman" w:hAnsi="Times New Roman" w:cs="Times New Roman"/>
+          <w:bCs/>
+          <w:sz w:val="28"/>
+          <w:szCs w:val="28"/>
+        </w:rPr>
+      </w:pPr>
+      <w:r>
+        <w:rPr>
+          <w:rFonts w:ascii="Times New Roman" w:hAnsi="Times New Roman" w:cs="Times New Roman"/>
+          <w:bCs/>
+          <w:sz w:val="28"/>
+          <w:szCs w:val="28"/>
+        </w:rPr>
+        <w:t xml:space="preserve">Изменения слиты в ветку </w:t>
+      </w:r>
+      <w:proofErr w:type="spellStart"/>
+      <w:r>
+        <w:rPr>
+          <w:rFonts w:ascii="Times New Roman" w:hAnsi="Times New Roman" w:cs="Times New Roman"/>
+          <w:bCs/>
+          <w:sz w:val="28"/>
+          <w:szCs w:val="28"/>
+        </w:rPr>
+        <w:t>dev</w:t>
+      </w:r>
+      <w:proofErr w:type="spellEnd"/>
+    </w:p>
+    <w:p>
+      <w:pPr>
+        <w:numPr>
+          <w:ilvl w:val="0"/>
+          <w:numId w:val="5"/>
+        </w:numPr>
+        <w:spacing w:line="360" w:lineRule="auto"/>
+        <w:ind w:left="0" w:firstLine="709"/>
+        <w:mirrorIndents/>
+        <w:jc w:val="both"/>
+        <w:rPr>
+          <w:rFonts w:ascii="Times New Roman" w:hAnsi="Times New Roman" w:cs="Times New Roman"/>
+          <w:bCs/>
+          <w:sz w:val="28"/>
+          <w:szCs w:val="28"/>
+          <w:lang w:val="en-US"/>
+        </w:rPr>
+      </w:pPr>
+      <w:r>
+        <w:rPr>
+          <w:rFonts w:ascii="Times New Roman" w:hAnsi="Times New Roman" w:cs="Times New Roman"/>
+          <w:bCs/>
+          <w:sz w:val="28"/>
+          <w:szCs w:val="28"/>
+        </w:rPr>
+        <w:t>Создан</w:t>
+      </w:r>
+      <w:r>
+        <w:rPr>
+          <w:rFonts w:ascii="Times New Roman" w:hAnsi="Times New Roman" w:cs="Times New Roman"/>
+          <w:bCs/>
+          <w:sz w:val="28"/>
+          <w:szCs w:val="28"/>
+          <w:lang w:val="en-US"/>
+        </w:rPr>
+        <w:t xml:space="preserve"> Pull Request </w:t>
+      </w:r>
+      <w:r>
+        <w:rPr>
+          <w:rFonts w:ascii="Times New Roman" w:hAnsi="Times New Roman" w:cs="Times New Roman"/>
+          <w:bCs/>
+          <w:sz w:val="28"/>
+          <w:szCs w:val="28"/>
+        </w:rPr>
+        <w:t>из</w:t>
+      </w:r>
+      <w:r>
+        <w:rPr>
+          <w:rFonts w:ascii="Times New Roman" w:hAnsi="Times New Roman" w:cs="Times New Roman"/>
+          <w:bCs/>
+          <w:sz w:val="28"/>
+          <w:szCs w:val="28"/>
+          <w:lang w:val="en-US"/>
+        </w:rPr>
+        <w:t xml:space="preserve"> dev </w:t>
+      </w:r>
+      <w:r>
+        <w:rPr>
+          <w:rFonts w:ascii="Times New Roman" w:hAnsi="Times New Roman" w:cs="Times New Roman"/>
+          <w:bCs/>
+          <w:sz w:val="28"/>
+          <w:szCs w:val="28"/>
+        </w:rPr>
+        <w:t>в</w:t>
+      </w:r>
+      <w:r>
+        <w:rPr>
+          <w:rFonts w:ascii="Times New Roman" w:hAnsi="Times New Roman" w:cs="Times New Roman"/>
+          <w:bCs/>
+          <w:sz w:val="28"/>
+          <w:szCs w:val="28"/>
+          <w:lang w:val="en-US"/>
+        </w:rPr>
+        <w:t xml:space="preserve"> main</w:t>
+      </w:r>
+    </w:p>
+    <w:p>
+      <w:pPr>
+        <w:numPr>
+          <w:ilvl w:val="0"/>
+          <w:numId w:val="5"/>
+        </w:numPr>
+        <w:spacing w:line="360" w:lineRule="auto"/>
+        <w:ind w:left="0" w:firstLine="709"/>
+        <w:mirrorIndents/>
+        <w:jc w:val="both"/>
+        <w:rPr>
+          <w:rFonts w:ascii="Times New Roman" w:hAnsi="Times New Roman" w:cs="Times New Roman"/>
+          <w:bCs/>
+          <w:sz w:val="28"/>
+          <w:szCs w:val="28"/>
+        </w:rPr>
+      </w:pPr>
+      <w:r>
+        <w:rPr>
+          <w:rFonts w:ascii="Times New Roman" w:hAnsi="Times New Roman" w:cs="Times New Roman"/>
+          <w:bCs/>
+          <w:sz w:val="28"/>
+          <w:szCs w:val="28"/>
+        </w:rPr>
+        <w:t xml:space="preserve">Pull </w:t>
+      </w:r>
+      <w:proofErr w:type="spellStart"/>
+      <w:r>
+        <w:rPr>
+          <w:rFonts w:ascii="Times New Roman" w:hAnsi="Times New Roman" w:cs="Times New Roman"/>
+          <w:bCs/>
+          <w:sz w:val="28"/>
+          <w:szCs w:val="28"/>
+        </w:rPr>
+        <w:t>Request</w:t>
+      </w:r>
+      <w:proofErr w:type="spellEnd"/>
+      <w:r>
+        <w:rPr>
+          <w:rFonts w:ascii="Times New Roman" w:hAnsi="Times New Roman" w:cs="Times New Roman"/>
+          <w:bCs/>
+          <w:sz w:val="28"/>
+          <w:szCs w:val="28"/>
+        </w:rPr>
+        <w:t xml:space="preserve"> одобрен и выполнен </w:t>
+      </w:r>
+      <w:proofErr w:type="spellStart"/>
+      <w:r>
+        <w:rPr>
+          <w:rFonts w:ascii="Times New Roman" w:hAnsi="Times New Roman" w:cs="Times New Roman"/>
+          <w:bCs/>
+          <w:sz w:val="28"/>
+          <w:szCs w:val="28"/>
+        </w:rPr>
+        <w:t>merge</w:t>
+      </w:r>
+      <w:proofErr w:type="spellEnd"/>
+    </w:p>
+    <w:p>
+      <w:pPr>
+        <w:spacing w:line="360" w:lineRule="auto"/>
+        <w:ind w:firstLine="709"/>
+        <w:mirrorIndents/>
+        <w:jc w:val="both"/>
+        <w:rPr>
+          <w:rFonts w:ascii="Times New Roman" w:hAnsi="Times New Roman" w:cs="Times New Roman"/>
+          <w:bCs/>
+          <w:sz w:val="28"/>
+          <w:szCs w:val="28"/>
+          <w:lang w:val="en-US"/>
+        </w:rPr>
+      </w:pPr>
+    </w:p>
+    <w:p>
+      <w:pPr>
+        <w:spacing w:line="360" w:lineRule="auto"/>
+        <w:ind w:firstLine="709"/>
+        <w:mirrorIndents/>
+        <w:jc w:val="both"/>
+        <w:rPr>
+          <w:rFonts w:ascii="Times New Roman" w:hAnsi="Times New Roman" w:cs="Times New Roman"/>
           <w:bCs/>
           <w:i/>
           <w:sz w:val="28"/>
@@ -11604,7 +12956,7 @@
         </w:rPr>
         <w:t xml:space="preserve">: </w:t>
       </w:r>
-      <w:hyperlink r:id="rId20" w:history="1">
+      <w:hyperlink r:id="rId21" w:history="1">
         <w:r>
           <w:rPr>
             <w:rStyle w:val="af1"/>
@@ -11618,7 +12970,7 @@
       </w:hyperlink>
     </w:p>
     <w:sectPr>
-      <w:footerReference w:type="default" r:id="rId21"/>
+      <w:footerReference w:type="default" r:id="rId22"/>
       <w:pgSz w:w="11906" w:h="16838" w:code="9"/>
       <w:pgMar w:top="1134" w:right="851" w:bottom="1134" w:left="1701" w:header="709" w:footer="709" w:gutter="0"/>
       <w:cols w:space="708"/>
@@ -11938,6 +13290,119 @@
     </w:lvl>
   </w:abstractNum>
   <w:abstractNum w:abstractNumId="2" w15:restartNumberingAfterBreak="0">
+    <w:nsid w:val="33A57CC0"/>
+    <w:multiLevelType w:val="multilevel"/>
+    <w:tmpl w:val="52C02ACA"/>
+    <w:lvl w:ilvl="0">
+      <w:start w:val="1"/>
+      <w:numFmt w:val="decimal"/>
+      <w:lvlText w:val="%1."/>
+      <w:lvlJc w:val="left"/>
+      <w:pPr>
+        <w:tabs>
+          <w:tab w:val="num" w:pos="720"/>
+        </w:tabs>
+        <w:ind w:left="720" w:hanging="360"/>
+      </w:pPr>
+    </w:lvl>
+    <w:lvl w:ilvl="1" w:tentative="1">
+      <w:start w:val="1"/>
+      <w:numFmt w:val="decimal"/>
+      <w:lvlText w:val="%2."/>
+      <w:lvlJc w:val="left"/>
+      <w:pPr>
+        <w:tabs>
+          <w:tab w:val="num" w:pos="1440"/>
+        </w:tabs>
+        <w:ind w:left="1440" w:hanging="360"/>
+      </w:pPr>
+    </w:lvl>
+    <w:lvl w:ilvl="2" w:tentative="1">
+      <w:start w:val="1"/>
+      <w:numFmt w:val="decimal"/>
+      <w:lvlText w:val="%3."/>
+      <w:lvlJc w:val="left"/>
+      <w:pPr>
+        <w:tabs>
+          <w:tab w:val="num" w:pos="2160"/>
+        </w:tabs>
+        <w:ind w:left="2160" w:hanging="360"/>
+      </w:pPr>
+    </w:lvl>
+    <w:lvl w:ilvl="3" w:tentative="1">
+      <w:start w:val="1"/>
+      <w:numFmt w:val="decimal"/>
+      <w:lvlText w:val="%4."/>
+      <w:lvlJc w:val="left"/>
+      <w:pPr>
+        <w:tabs>
+          <w:tab w:val="num" w:pos="2880"/>
+        </w:tabs>
+        <w:ind w:left="2880" w:hanging="360"/>
+      </w:pPr>
+    </w:lvl>
+    <w:lvl w:ilvl="4" w:tentative="1">
+      <w:start w:val="1"/>
+      <w:numFmt w:val="decimal"/>
+      <w:lvlText w:val="%5."/>
+      <w:lvlJc w:val="left"/>
+      <w:pPr>
+        <w:tabs>
+          <w:tab w:val="num" w:pos="3600"/>
+        </w:tabs>
+        <w:ind w:left="3600" w:hanging="360"/>
+      </w:pPr>
+    </w:lvl>
+    <w:lvl w:ilvl="5" w:tentative="1">
+      <w:start w:val="1"/>
+      <w:numFmt w:val="decimal"/>
+      <w:lvlText w:val="%6."/>
+      <w:lvlJc w:val="left"/>
+      <w:pPr>
+        <w:tabs>
+          <w:tab w:val="num" w:pos="4320"/>
+        </w:tabs>
+        <w:ind w:left="4320" w:hanging="360"/>
+      </w:pPr>
+    </w:lvl>
+    <w:lvl w:ilvl="6" w:tentative="1">
+      <w:start w:val="1"/>
+      <w:numFmt w:val="decimal"/>
+      <w:lvlText w:val="%7."/>
+      <w:lvlJc w:val="left"/>
+      <w:pPr>
+        <w:tabs>
+          <w:tab w:val="num" w:pos="5040"/>
+        </w:tabs>
+        <w:ind w:left="5040" w:hanging="360"/>
+      </w:pPr>
+    </w:lvl>
+    <w:lvl w:ilvl="7" w:tentative="1">
+      <w:start w:val="1"/>
+      <w:numFmt w:val="decimal"/>
+      <w:lvlText w:val="%8."/>
+      <w:lvlJc w:val="left"/>
+      <w:pPr>
+        <w:tabs>
+          <w:tab w:val="num" w:pos="5760"/>
+        </w:tabs>
+        <w:ind w:left="5760" w:hanging="360"/>
+      </w:pPr>
+    </w:lvl>
+    <w:lvl w:ilvl="8" w:tentative="1">
+      <w:start w:val="1"/>
+      <w:numFmt w:val="decimal"/>
+      <w:lvlText w:val="%9."/>
+      <w:lvlJc w:val="left"/>
+      <w:pPr>
+        <w:tabs>
+          <w:tab w:val="num" w:pos="6480"/>
+        </w:tabs>
+        <w:ind w:left="6480" w:hanging="360"/>
+      </w:pPr>
+    </w:lvl>
+  </w:abstractNum>
+  <w:abstractNum w:abstractNumId="3" w15:restartNumberingAfterBreak="0">
     <w:nsid w:val="3E980B14"/>
     <w:multiLevelType w:val="multilevel"/>
     <w:tmpl w:val="64E2B5EC"/>
@@ -12086,7 +13551,7 @@
       </w:rPr>
     </w:lvl>
   </w:abstractNum>
-  <w:abstractNum w:abstractNumId="3" w15:restartNumberingAfterBreak="0">
+  <w:abstractNum w:abstractNumId="4" w15:restartNumberingAfterBreak="0">
     <w:nsid w:val="7C593409"/>
     <w:multiLevelType w:val="hybridMultilevel"/>
     <w:tmpl w:val="4D485638"/>
@@ -12182,9 +13647,12 @@
     <w:abstractNumId w:val="1"/>
   </w:num>
   <w:num w:numId="3" w16cid:durableId="586036355">
+    <w:abstractNumId w:val="4"/>
+  </w:num>
+  <w:num w:numId="4" w16cid:durableId="1524200134">
     <w:abstractNumId w:val="3"/>
   </w:num>
-  <w:num w:numId="4" w16cid:durableId="1524200134">
+  <w:num w:numId="5" w16cid:durableId="139075348">
     <w:abstractNumId w:val="2"/>
   </w:num>
 </w:numbering>
@@ -12798,7 +14266,6 @@
   <w:style w:type="character" w:default="1" w:styleId="a0">
     <w:name w:val="Default Paragraph Font"/>
     <w:uiPriority w:val="1"/>
-    <w:semiHidden/>
     <w:unhideWhenUsed/>
   </w:style>
   <w:style w:type="table" w:default="1" w:styleId="a1">
@@ -13220,6 +14687,25 @@
       <w:u w:val="single"/>
     </w:rPr>
   </w:style>
+  <w:style w:type="table" w:styleId="af4">
+    <w:name w:val="Table Grid"/>
+    <w:basedOn w:val="a1"/>
+    <w:uiPriority w:val="39"/>
+    <w:rsid w:val="008D6597"/>
+    <w:pPr>
+      <w:spacing w:after="0" w:line="240" w:lineRule="auto"/>
+    </w:pPr>
+    <w:tblPr>
+      <w:tblBorders>
+        <w:top w:val="single" w:sz="4" w:space="0" w:color="auto"/>
+        <w:left w:val="single" w:sz="4" w:space="0" w:color="auto"/>
+        <w:bottom w:val="single" w:sz="4" w:space="0" w:color="auto"/>
+        <w:right w:val="single" w:sz="4" w:space="0" w:color="auto"/>
+        <w:insideH w:val="single" w:sz="4" w:space="0" w:color="auto"/>
+        <w:insideV w:val="single" w:sz="4" w:space="0" w:color="auto"/>
+      </w:tblBorders>
+    </w:tblPr>
+  </w:style>
 </w:styles>
 </file>
 

</xml_diff>

<commit_message>
Clean repository: remove ignored files from tracking
</commit_message>
<xml_diff>
--- a/docs/Отчёт_ЛР_№1_Нелин_ТАУ_Шоглин_ММ_СМ11-61Б.docx
+++ b/docs/Отчёт_ЛР_№1_Нелин_ТАУ_Шоглин_ММ_СМ11-61Б.docx
@@ -608,23 +608,13 @@
           <w:szCs w:val="28"/>
         </w:rPr>
       </w:pPr>
-      <w:proofErr w:type="gramStart"/>
-      <w:r>
-        <w:rPr>
-          <w:rFonts w:ascii="Times New Roman" w:hAnsi="Times New Roman" w:cs="Times New Roman"/>
-          <w:sz w:val="28"/>
-          <w:szCs w:val="28"/>
-        </w:rPr>
-        <w:t xml:space="preserve">Группа:   </w:t>
-      </w:r>
-      <w:proofErr w:type="gramEnd"/>
-      <w:r>
-        <w:rPr>
-          <w:rFonts w:ascii="Times New Roman" w:hAnsi="Times New Roman" w:cs="Times New Roman"/>
-          <w:sz w:val="28"/>
-          <w:szCs w:val="28"/>
-        </w:rPr>
-        <w:t xml:space="preserve">   СМ1</w:t>
+      <w:r>
+        <w:rPr>
+          <w:rFonts w:ascii="Times New Roman" w:hAnsi="Times New Roman" w:cs="Times New Roman"/>
+          <w:sz w:val="28"/>
+          <w:szCs w:val="28"/>
+        </w:rPr>
+        <w:t>Группа:      СМ1</w:t>
       </w:r>
       <w:r>
         <w:rPr>
@@ -4034,27 +4024,7 @@
           <w:sz w:val="28"/>
           <w:szCs w:val="28"/>
         </w:rPr>
-        <w:t xml:space="preserve">1. Рекомендуется изучить интерактивный курс </w:t>
-      </w:r>
-      <w:proofErr w:type="spellStart"/>
-      <w:r>
-        <w:rPr>
-          <w:rFonts w:ascii="Times New Roman" w:hAnsi="Times New Roman" w:cs="Times New Roman"/>
-          <w:bCs/>
-          <w:sz w:val="28"/>
-          <w:szCs w:val="28"/>
-        </w:rPr>
-        <w:t>GitHowTo</w:t>
-      </w:r>
-      <w:proofErr w:type="spellEnd"/>
-      <w:r>
-        <w:rPr>
-          <w:rFonts w:ascii="Times New Roman" w:hAnsi="Times New Roman" w:cs="Times New Roman"/>
-          <w:bCs/>
-          <w:sz w:val="28"/>
-          <w:szCs w:val="28"/>
-        </w:rPr>
-        <w:t xml:space="preserve">. Его прохождение позволит вам подробнее познакомиться с этой системой контроля версий. Если хочется изучить ее более полно, то рекомендуем к </w:t>
+        <w:t xml:space="preserve">1. Рекомендуется изучить интерактивный курс GitHowTo. Его прохождение позволит вам подробнее познакомиться с этой системой контроля версий. Если хочется изучить ее более полно, то рекомендуем к </w:t>
       </w:r>
       <w:r>
         <w:rPr>
@@ -4088,27 +4058,7 @@
           <w:sz w:val="28"/>
           <w:szCs w:val="28"/>
         </w:rPr>
-        <w:t xml:space="preserve">2. Рекомендуется сгенерировать SSH ключ и добавить его в аккаунт </w:t>
-      </w:r>
-      <w:proofErr w:type="spellStart"/>
-      <w:r>
-        <w:rPr>
-          <w:rFonts w:ascii="Times New Roman" w:hAnsi="Times New Roman" w:cs="Times New Roman"/>
-          <w:bCs/>
-          <w:sz w:val="28"/>
-          <w:szCs w:val="28"/>
-        </w:rPr>
-        <w:t>GitHub</w:t>
-      </w:r>
-      <w:proofErr w:type="spellEnd"/>
-      <w:r>
-        <w:rPr>
-          <w:rFonts w:ascii="Times New Roman" w:hAnsi="Times New Roman" w:cs="Times New Roman"/>
-          <w:bCs/>
-          <w:sz w:val="28"/>
-          <w:szCs w:val="28"/>
-        </w:rPr>
-        <w:t xml:space="preserve">, если такового у вас ещё не имеется. Его наличие существенно упростит работу с удаленными репозиториями. Инструкцию по его созданию и добавления вы можете найти в файле SSH_key_generation.pdf. </w:t>
+        <w:t xml:space="preserve">2. Рекомендуется сгенерировать SSH ключ и добавить его в аккаунт GitHub, если такового у вас ещё не имеется. Его наличие существенно упростит работу с удаленными репозиториями. Инструкцию по его созданию и добавления вы можете найти в файле SSH_key_generation.pdf. </w:t>
       </w:r>
     </w:p>
     <w:p>
@@ -4156,27 +4106,7 @@
           <w:sz w:val="28"/>
           <w:szCs w:val="28"/>
         </w:rPr>
-        <w:t xml:space="preserve">a. Создать публичный репозиторий на </w:t>
-      </w:r>
-      <w:proofErr w:type="spellStart"/>
-      <w:r>
-        <w:rPr>
-          <w:rFonts w:ascii="Times New Roman" w:hAnsi="Times New Roman" w:cs="Times New Roman"/>
-          <w:bCs/>
-          <w:sz w:val="28"/>
-          <w:szCs w:val="28"/>
-        </w:rPr>
-        <w:t>GitHub</w:t>
-      </w:r>
-      <w:proofErr w:type="spellEnd"/>
-      <w:r>
-        <w:rPr>
-          <w:rFonts w:ascii="Times New Roman" w:hAnsi="Times New Roman" w:cs="Times New Roman"/>
-          <w:bCs/>
-          <w:sz w:val="28"/>
-          <w:szCs w:val="28"/>
-        </w:rPr>
-        <w:t xml:space="preserve">; </w:t>
+        <w:t xml:space="preserve">a. Создать публичный репозиторий на GitHub; </w:t>
       </w:r>
     </w:p>
     <w:p>
@@ -4200,47 +4130,7 @@
           <w:sz w:val="28"/>
           <w:szCs w:val="28"/>
         </w:rPr>
-        <w:t xml:space="preserve">b. Привязать созданный репозиторий к локальному при помощи </w:t>
-      </w:r>
-      <w:proofErr w:type="spellStart"/>
-      <w:r>
-        <w:rPr>
-          <w:rFonts w:ascii="Times New Roman" w:hAnsi="Times New Roman" w:cs="Times New Roman"/>
-          <w:bCs/>
-          <w:sz w:val="28"/>
-          <w:szCs w:val="28"/>
-        </w:rPr>
-        <w:t>git</w:t>
-      </w:r>
-      <w:proofErr w:type="spellEnd"/>
-      <w:r>
-        <w:rPr>
-          <w:rFonts w:ascii="Times New Roman" w:hAnsi="Times New Roman" w:cs="Times New Roman"/>
-          <w:bCs/>
-          <w:sz w:val="28"/>
-          <w:szCs w:val="28"/>
-        </w:rPr>
-        <w:t xml:space="preserve"> </w:t>
-      </w:r>
-      <w:proofErr w:type="spellStart"/>
-      <w:r>
-        <w:rPr>
-          <w:rFonts w:ascii="Times New Roman" w:hAnsi="Times New Roman" w:cs="Times New Roman"/>
-          <w:bCs/>
-          <w:sz w:val="28"/>
-          <w:szCs w:val="28"/>
-        </w:rPr>
-        <w:t>remote</w:t>
-      </w:r>
-      <w:proofErr w:type="spellEnd"/>
-      <w:r>
-        <w:rPr>
-          <w:rFonts w:ascii="Times New Roman" w:hAnsi="Times New Roman" w:cs="Times New Roman"/>
-          <w:bCs/>
-          <w:sz w:val="28"/>
-          <w:szCs w:val="28"/>
-        </w:rPr>
-        <w:t xml:space="preserve">; </w:t>
+        <w:t xml:space="preserve">b. Привязать созданный репозиторий к локальному при помощи git remote; </w:t>
       </w:r>
     </w:p>
     <w:p>
@@ -4288,47 +4178,7 @@
           <w:sz w:val="28"/>
           <w:szCs w:val="28"/>
         </w:rPr>
-        <w:t xml:space="preserve">     1) В инициализированном репозитории сделать </w:t>
-      </w:r>
-      <w:proofErr w:type="spellStart"/>
-      <w:r>
-        <w:rPr>
-          <w:rFonts w:ascii="Times New Roman" w:hAnsi="Times New Roman" w:cs="Times New Roman"/>
-          <w:bCs/>
-          <w:sz w:val="28"/>
-          <w:szCs w:val="28"/>
-        </w:rPr>
-        <w:t>initial</w:t>
-      </w:r>
-      <w:proofErr w:type="spellEnd"/>
-      <w:r>
-        <w:rPr>
-          <w:rFonts w:ascii="Times New Roman" w:hAnsi="Times New Roman" w:cs="Times New Roman"/>
-          <w:bCs/>
-          <w:sz w:val="28"/>
-          <w:szCs w:val="28"/>
-        </w:rPr>
-        <w:t xml:space="preserve"> коммит и создать новую ветку </w:t>
-      </w:r>
-      <w:proofErr w:type="spellStart"/>
-      <w:r>
-        <w:rPr>
-          <w:rFonts w:ascii="Times New Roman" w:hAnsi="Times New Roman" w:cs="Times New Roman"/>
-          <w:bCs/>
-          <w:sz w:val="28"/>
-          <w:szCs w:val="28"/>
-        </w:rPr>
-        <w:t>dev</w:t>
-      </w:r>
-      <w:proofErr w:type="spellEnd"/>
-      <w:r>
-        <w:rPr>
-          <w:rFonts w:ascii="Times New Roman" w:hAnsi="Times New Roman" w:cs="Times New Roman"/>
-          <w:bCs/>
-          <w:sz w:val="28"/>
-          <w:szCs w:val="28"/>
-        </w:rPr>
-        <w:t xml:space="preserve">; </w:t>
+        <w:t xml:space="preserve">     1) В инициализированном репозитории сделать initial коммит и создать новую ветку dev; </w:t>
       </w:r>
     </w:p>
     <w:p>
@@ -4376,47 +4226,7 @@
           <w:sz w:val="28"/>
           <w:szCs w:val="28"/>
         </w:rPr>
-        <w:t xml:space="preserve">    3) От ветки </w:t>
-      </w:r>
-      <w:proofErr w:type="spellStart"/>
-      <w:r>
-        <w:rPr>
-          <w:rFonts w:ascii="Times New Roman" w:hAnsi="Times New Roman" w:cs="Times New Roman"/>
-          <w:bCs/>
-          <w:sz w:val="28"/>
-          <w:szCs w:val="28"/>
-        </w:rPr>
-        <w:t>dev</w:t>
-      </w:r>
-      <w:proofErr w:type="spellEnd"/>
-      <w:r>
-        <w:rPr>
-          <w:rFonts w:ascii="Times New Roman" w:hAnsi="Times New Roman" w:cs="Times New Roman"/>
-          <w:bCs/>
-          <w:sz w:val="28"/>
-          <w:szCs w:val="28"/>
-        </w:rPr>
-        <w:t xml:space="preserve"> создать новую ветку </w:t>
-      </w:r>
-      <w:proofErr w:type="spellStart"/>
-      <w:r>
-        <w:rPr>
-          <w:rFonts w:ascii="Times New Roman" w:hAnsi="Times New Roman" w:cs="Times New Roman"/>
-          <w:bCs/>
-          <w:sz w:val="28"/>
-          <w:szCs w:val="28"/>
-        </w:rPr>
-        <w:t>feature-viscous_friction</w:t>
-      </w:r>
-      <w:proofErr w:type="spellEnd"/>
-      <w:r>
-        <w:rPr>
-          <w:rFonts w:ascii="Times New Roman" w:hAnsi="Times New Roman" w:cs="Times New Roman"/>
-          <w:bCs/>
-          <w:sz w:val="28"/>
-          <w:szCs w:val="28"/>
-        </w:rPr>
-        <w:t xml:space="preserve"> и выполнить в ней пункт 3; </w:t>
+        <w:t xml:space="preserve">    3) От ветки dev создать новую ветку feature-viscous_friction и выполнить в ней пункт 3; </w:t>
       </w:r>
     </w:p>
     <w:p>
@@ -4440,47 +4250,7 @@
           <w:sz w:val="28"/>
           <w:szCs w:val="28"/>
         </w:rPr>
-        <w:t xml:space="preserve">    4) Слить изменения из ветки </w:t>
-      </w:r>
-      <w:proofErr w:type="spellStart"/>
-      <w:r>
-        <w:rPr>
-          <w:rFonts w:ascii="Times New Roman" w:hAnsi="Times New Roman" w:cs="Times New Roman"/>
-          <w:bCs/>
-          <w:sz w:val="28"/>
-          <w:szCs w:val="28"/>
-        </w:rPr>
-        <w:t>feature-viscous_friction</w:t>
-      </w:r>
-      <w:proofErr w:type="spellEnd"/>
-      <w:r>
-        <w:rPr>
-          <w:rFonts w:ascii="Times New Roman" w:hAnsi="Times New Roman" w:cs="Times New Roman"/>
-          <w:bCs/>
-          <w:sz w:val="28"/>
-          <w:szCs w:val="28"/>
-        </w:rPr>
-        <w:t xml:space="preserve"> в ветку </w:t>
-      </w:r>
-      <w:proofErr w:type="spellStart"/>
-      <w:r>
-        <w:rPr>
-          <w:rFonts w:ascii="Times New Roman" w:hAnsi="Times New Roman" w:cs="Times New Roman"/>
-          <w:bCs/>
-          <w:sz w:val="28"/>
-          <w:szCs w:val="28"/>
-        </w:rPr>
-        <w:t>dev</w:t>
-      </w:r>
-      <w:proofErr w:type="spellEnd"/>
-      <w:r>
-        <w:rPr>
-          <w:rFonts w:ascii="Times New Roman" w:hAnsi="Times New Roman" w:cs="Times New Roman"/>
-          <w:bCs/>
-          <w:sz w:val="28"/>
-          <w:szCs w:val="28"/>
-        </w:rPr>
-        <w:t xml:space="preserve">; </w:t>
+        <w:t xml:space="preserve">    4) Слить изменения из ветки feature-viscous_friction в ветку dev; </w:t>
       </w:r>
     </w:p>
     <w:p>
@@ -4504,67 +4274,7 @@
           <w:sz w:val="28"/>
           <w:szCs w:val="28"/>
         </w:rPr>
-        <w:t xml:space="preserve">    5) Сделать </w:t>
-      </w:r>
-      <w:proofErr w:type="spellStart"/>
-      <w:r>
-        <w:rPr>
-          <w:rFonts w:ascii="Times New Roman" w:hAnsi="Times New Roman" w:cs="Times New Roman"/>
-          <w:bCs/>
-          <w:sz w:val="28"/>
-          <w:szCs w:val="28"/>
-        </w:rPr>
-        <w:t>push</w:t>
-      </w:r>
-      <w:proofErr w:type="spellEnd"/>
-      <w:r>
-        <w:rPr>
-          <w:rFonts w:ascii="Times New Roman" w:hAnsi="Times New Roman" w:cs="Times New Roman"/>
-          <w:bCs/>
-          <w:sz w:val="28"/>
-          <w:szCs w:val="28"/>
-        </w:rPr>
-        <w:t xml:space="preserve"> ветки </w:t>
-      </w:r>
-      <w:proofErr w:type="spellStart"/>
-      <w:r>
-        <w:rPr>
-          <w:rFonts w:ascii="Times New Roman" w:hAnsi="Times New Roman" w:cs="Times New Roman"/>
-          <w:bCs/>
-          <w:sz w:val="28"/>
-          <w:szCs w:val="28"/>
-        </w:rPr>
-        <w:t>dev</w:t>
-      </w:r>
-      <w:proofErr w:type="spellEnd"/>
-      <w:r>
-        <w:rPr>
-          <w:rFonts w:ascii="Times New Roman" w:hAnsi="Times New Roman" w:cs="Times New Roman"/>
-          <w:bCs/>
-          <w:sz w:val="28"/>
-          <w:szCs w:val="28"/>
-        </w:rPr>
-        <w:t xml:space="preserve"> на </w:t>
-      </w:r>
-      <w:proofErr w:type="spellStart"/>
-      <w:r>
-        <w:rPr>
-          <w:rFonts w:ascii="Times New Roman" w:hAnsi="Times New Roman" w:cs="Times New Roman"/>
-          <w:bCs/>
-          <w:sz w:val="28"/>
-          <w:szCs w:val="28"/>
-        </w:rPr>
-        <w:t>GitHub</w:t>
-      </w:r>
-      <w:proofErr w:type="spellEnd"/>
-      <w:r>
-        <w:rPr>
-          <w:rFonts w:ascii="Times New Roman" w:hAnsi="Times New Roman" w:cs="Times New Roman"/>
-          <w:bCs/>
-          <w:sz w:val="28"/>
-          <w:szCs w:val="28"/>
-        </w:rPr>
-        <w:t xml:space="preserve">; </w:t>
+        <w:t xml:space="preserve">    5) Сделать push ветки dev на GitHub; </w:t>
       </w:r>
     </w:p>
     <w:p>
@@ -4588,127 +4298,7 @@
           <w:sz w:val="28"/>
           <w:szCs w:val="28"/>
         </w:rPr>
-        <w:t xml:space="preserve">    6) Создать </w:t>
-      </w:r>
-      <w:proofErr w:type="spellStart"/>
-      <w:r>
-        <w:rPr>
-          <w:rFonts w:ascii="Times New Roman" w:hAnsi="Times New Roman" w:cs="Times New Roman"/>
-          <w:bCs/>
-          <w:sz w:val="28"/>
-          <w:szCs w:val="28"/>
-        </w:rPr>
-        <w:t>merge</w:t>
-      </w:r>
-      <w:proofErr w:type="spellEnd"/>
-      <w:r>
-        <w:rPr>
-          <w:rFonts w:ascii="Times New Roman" w:hAnsi="Times New Roman" w:cs="Times New Roman"/>
-          <w:bCs/>
-          <w:sz w:val="28"/>
-          <w:szCs w:val="28"/>
-        </w:rPr>
-        <w:t xml:space="preserve"> </w:t>
-      </w:r>
-      <w:proofErr w:type="spellStart"/>
-      <w:r>
-        <w:rPr>
-          <w:rFonts w:ascii="Times New Roman" w:hAnsi="Times New Roman" w:cs="Times New Roman"/>
-          <w:bCs/>
-          <w:sz w:val="28"/>
-          <w:szCs w:val="28"/>
-        </w:rPr>
-        <w:t>request</w:t>
-      </w:r>
-      <w:proofErr w:type="spellEnd"/>
-      <w:r>
-        <w:rPr>
-          <w:rFonts w:ascii="Times New Roman" w:hAnsi="Times New Roman" w:cs="Times New Roman"/>
-          <w:bCs/>
-          <w:sz w:val="28"/>
-          <w:szCs w:val="28"/>
-        </w:rPr>
-        <w:t xml:space="preserve"> в ветку </w:t>
-      </w:r>
-      <w:proofErr w:type="spellStart"/>
-      <w:r>
-        <w:rPr>
-          <w:rFonts w:ascii="Times New Roman" w:hAnsi="Times New Roman" w:cs="Times New Roman"/>
-          <w:bCs/>
-          <w:sz w:val="28"/>
-          <w:szCs w:val="28"/>
-        </w:rPr>
-        <w:t>master</w:t>
-      </w:r>
-      <w:proofErr w:type="spellEnd"/>
-      <w:r>
-        <w:rPr>
-          <w:rFonts w:ascii="Times New Roman" w:hAnsi="Times New Roman" w:cs="Times New Roman"/>
-          <w:bCs/>
-          <w:sz w:val="28"/>
-          <w:szCs w:val="28"/>
-        </w:rPr>
-        <w:t xml:space="preserve"> (</w:t>
-      </w:r>
-      <w:proofErr w:type="spellStart"/>
-      <w:r>
-        <w:rPr>
-          <w:rFonts w:ascii="Times New Roman" w:hAnsi="Times New Roman" w:cs="Times New Roman"/>
-          <w:bCs/>
-          <w:sz w:val="28"/>
-          <w:szCs w:val="28"/>
-        </w:rPr>
-        <w:t>main</w:t>
-      </w:r>
-      <w:proofErr w:type="spellEnd"/>
-      <w:r>
-        <w:rPr>
-          <w:rFonts w:ascii="Times New Roman" w:hAnsi="Times New Roman" w:cs="Times New Roman"/>
-          <w:bCs/>
-          <w:sz w:val="28"/>
-          <w:szCs w:val="28"/>
-        </w:rPr>
-        <w:t xml:space="preserve">), назначить себя проверяющим и одобрить </w:t>
-      </w:r>
-      <w:proofErr w:type="spellStart"/>
-      <w:r>
-        <w:rPr>
-          <w:rFonts w:ascii="Times New Roman" w:hAnsi="Times New Roman" w:cs="Times New Roman"/>
-          <w:bCs/>
-          <w:sz w:val="28"/>
-          <w:szCs w:val="28"/>
-        </w:rPr>
-        <w:t>merge</w:t>
-      </w:r>
-      <w:proofErr w:type="spellEnd"/>
-      <w:r>
-        <w:rPr>
-          <w:rFonts w:ascii="Times New Roman" w:hAnsi="Times New Roman" w:cs="Times New Roman"/>
-          <w:bCs/>
-          <w:sz w:val="28"/>
-          <w:szCs w:val="28"/>
-        </w:rPr>
-        <w:t xml:space="preserve"> </w:t>
-      </w:r>
-      <w:proofErr w:type="spellStart"/>
-      <w:r>
-        <w:rPr>
-          <w:rFonts w:ascii="Times New Roman" w:hAnsi="Times New Roman" w:cs="Times New Roman"/>
-          <w:bCs/>
-          <w:sz w:val="28"/>
-          <w:szCs w:val="28"/>
-        </w:rPr>
-        <w:t>request</w:t>
-      </w:r>
-      <w:proofErr w:type="spellEnd"/>
-      <w:r>
-        <w:rPr>
-          <w:rFonts w:ascii="Times New Roman" w:hAnsi="Times New Roman" w:cs="Times New Roman"/>
-          <w:bCs/>
-          <w:sz w:val="28"/>
-          <w:szCs w:val="28"/>
-        </w:rPr>
-        <w:t xml:space="preserve">; </w:t>
+        <w:t xml:space="preserve">    6) Создать merge request в ветку master (main), назначить себя проверяющим и одобрить merge request; </w:t>
       </w:r>
     </w:p>
     <w:p>
@@ -4844,27 +4434,7 @@
           <w:sz w:val="28"/>
           <w:szCs w:val="28"/>
         </w:rPr>
-        <w:t>Постановка задачи</w:t>
-      </w:r>
-      <w:proofErr w:type="gramStart"/>
-      <w:r>
-        <w:rPr>
-          <w:rFonts w:ascii="Times New Roman" w:hAnsi="Times New Roman" w:cs="Times New Roman"/>
-          <w:bCs/>
-          <w:sz w:val="28"/>
-          <w:szCs w:val="28"/>
-        </w:rPr>
-        <w:t>: Создать</w:t>
-      </w:r>
-      <w:proofErr w:type="gramEnd"/>
-      <w:r>
-        <w:rPr>
-          <w:rFonts w:ascii="Times New Roman" w:hAnsi="Times New Roman" w:cs="Times New Roman"/>
-          <w:bCs/>
-          <w:sz w:val="28"/>
-          <w:szCs w:val="28"/>
-        </w:rPr>
-        <w:t xml:space="preserve"> модель ДПТ с ПВ без учета сил сопротивления и момента нагрузки, построить графики тока, скорости и момента, а также его механическую характеристику (зависимость скорости от момента) при подаче 5 В</w:t>
+        <w:t>Постановка задачи: Создать модель ДПТ с ПВ без учета сил сопротивления и момента нагрузки, построить графики тока, скорости и момента, а также его механическую характеристику (зависимость скорости от момента) при подаче 5 В</w:t>
       </w:r>
       <w:r>
         <w:rPr>
@@ -9479,7 +9049,6 @@
           <w:szCs w:val="28"/>
         </w:rPr>
       </w:pPr>
-      <w:proofErr w:type="gramStart"/>
       <w:r>
         <w:rPr>
           <w:rFonts w:ascii="Times New Roman" w:hAnsi="Times New Roman" w:cs="Times New Roman"/>
@@ -9496,17 +9065,7 @@
           <w:sz w:val="28"/>
           <w:szCs w:val="28"/>
         </w:rPr>
-        <w:t xml:space="preserve"> котором согласно полученным уравнениям</w:t>
-      </w:r>
-      <w:proofErr w:type="gramEnd"/>
-      <w:r>
-        <w:rPr>
-          <w:rFonts w:ascii="Times New Roman" w:hAnsi="Times New Roman" w:cs="Times New Roman"/>
-          <w:bCs/>
-          <w:sz w:val="28"/>
-          <w:szCs w:val="28"/>
-        </w:rPr>
-        <w:t xml:space="preserve"> реализуем схему</w:t>
+        <w:t xml:space="preserve"> котором согласно полученным уравнениям реализуем схему</w:t>
       </w:r>
       <w:r>
         <w:rPr>
@@ -9591,38 +9150,7 @@
           <w:sz w:val="28"/>
           <w:szCs w:val="28"/>
         </w:rPr>
-        <w:t xml:space="preserve">Рисунок 2 – Схема ДПТ С ПВ при </w:t>
-      </w:r>
-      <w:proofErr w:type="spellStart"/>
-      <w:proofErr w:type="gramStart"/>
-      <w:r>
-        <w:rPr>
-          <w:rFonts w:ascii="Times New Roman" w:hAnsi="Times New Roman" w:cs="Times New Roman"/>
-          <w:bCs/>
-          <w:sz w:val="28"/>
-          <w:szCs w:val="28"/>
-        </w:rPr>
-        <w:t>Мтр</w:t>
-      </w:r>
-      <w:proofErr w:type="spellEnd"/>
-      <w:r>
-        <w:rPr>
-          <w:rFonts w:ascii="Times New Roman" w:hAnsi="Times New Roman" w:cs="Times New Roman"/>
-          <w:bCs/>
-          <w:sz w:val="28"/>
-          <w:szCs w:val="28"/>
-        </w:rPr>
-        <w:t xml:space="preserve">  =</w:t>
-      </w:r>
-      <w:proofErr w:type="gramEnd"/>
-      <w:r>
-        <w:rPr>
-          <w:rFonts w:ascii="Times New Roman" w:hAnsi="Times New Roman" w:cs="Times New Roman"/>
-          <w:bCs/>
-          <w:sz w:val="28"/>
-          <w:szCs w:val="28"/>
-        </w:rPr>
-        <w:t xml:space="preserve"> 0</w:t>
+        <w:t>Рисунок 2 – Схема ДПТ С ПВ при Мтр  = 0</w:t>
       </w:r>
     </w:p>
     <w:p>
@@ -10019,27 +9547,7 @@
           <w:szCs w:val="28"/>
         </w:rPr>
         <w:lastRenderedPageBreak/>
-        <w:t>Постановка задачи</w:t>
-      </w:r>
-      <w:proofErr w:type="gramStart"/>
-      <w:r>
-        <w:rPr>
-          <w:rFonts w:ascii="Times New Roman" w:hAnsi="Times New Roman" w:cs="Times New Roman"/>
-          <w:bCs/>
-          <w:sz w:val="28"/>
-          <w:szCs w:val="28"/>
-        </w:rPr>
-        <w:t>: Повторно</w:t>
-      </w:r>
-      <w:proofErr w:type="gramEnd"/>
-      <w:r>
-        <w:rPr>
-          <w:rFonts w:ascii="Times New Roman" w:hAnsi="Times New Roman" w:cs="Times New Roman"/>
-          <w:bCs/>
-          <w:sz w:val="28"/>
-          <w:szCs w:val="28"/>
-        </w:rPr>
-        <w:t xml:space="preserve"> построить графики при подаче 10 В, доказать, что система является нелинейной на основе полученных графиков</w:t>
+        <w:t>Постановка задачи: Повторно построить графики при подаче 10 В, доказать, что система является нелинейной на основе полученных графиков</w:t>
       </w:r>
       <w:r>
         <w:rPr>
@@ -10620,27 +10128,7 @@
           <w:sz w:val="28"/>
           <w:szCs w:val="28"/>
         </w:rPr>
-        <w:t>Постановка задачи</w:t>
-      </w:r>
-      <w:proofErr w:type="gramStart"/>
-      <w:r>
-        <w:rPr>
-          <w:rFonts w:ascii="Times New Roman" w:hAnsi="Times New Roman" w:cs="Times New Roman"/>
-          <w:bCs/>
-          <w:sz w:val="28"/>
-          <w:szCs w:val="28"/>
-        </w:rPr>
-        <w:t>: Добавить</w:t>
-      </w:r>
-      <w:proofErr w:type="gramEnd"/>
-      <w:r>
-        <w:rPr>
-          <w:rFonts w:ascii="Times New Roman" w:hAnsi="Times New Roman" w:cs="Times New Roman"/>
-          <w:bCs/>
-          <w:sz w:val="28"/>
-          <w:szCs w:val="28"/>
-        </w:rPr>
-        <w:t xml:space="preserve"> в систему внутреннее вязкое трение (</w:t>
+        <w:t>Постановка задачи: Добавить в систему внутреннее вязкое трение (</w:t>
       </w:r>
       <m:oMath>
         <m:sSub>
@@ -10901,10 +10389,10 @@
           <w:noProof/>
         </w:rPr>
         <w:drawing>
-          <wp:inline distT="0" distB="0" distL="0" distR="0" wp14:anchorId="5041973D" wp14:editId="07060E70">
-            <wp:extent cx="5939790" cy="5742305"/>
-            <wp:effectExtent l="0" t="0" r="3810" b="0"/>
-            <wp:docPr id="349535577" name="Рисунок 1"/>
+          <wp:inline distT="0" distB="0" distL="0" distR="0" wp14:anchorId="72ADF28D" wp14:editId="78643CC0">
+            <wp:extent cx="5604510" cy="5458316"/>
+            <wp:effectExtent l="0" t="0" r="0" b="9525"/>
+            <wp:docPr id="293243036" name="Рисунок 1"/>
             <wp:cNvGraphicFramePr>
               <a:graphicFrameLocks xmlns:a="http://schemas.openxmlformats.org/drawingml/2006/main" noChangeAspect="1"/>
             </wp:cNvGraphicFramePr>
@@ -10912,7 +10400,7 @@
               <a:graphicData uri="http://schemas.openxmlformats.org/drawingml/2006/picture">
                 <pic:pic xmlns:pic="http://schemas.openxmlformats.org/drawingml/2006/picture">
                   <pic:nvPicPr>
-                    <pic:cNvPr id="349535577" name=""/>
+                    <pic:cNvPr id="293243036" name=""/>
                     <pic:cNvPicPr/>
                   </pic:nvPicPr>
                   <pic:blipFill>
@@ -10924,7 +10412,7 @@
                   <pic:spPr>
                     <a:xfrm>
                       <a:off x="0" y="0"/>
-                      <a:ext cx="5939790" cy="5742305"/>
+                      <a:ext cx="5616232" cy="5469732"/>
                     </a:xfrm>
                     <a:prstGeom prst="rect">
                       <a:avLst/>
@@ -10958,7 +10446,6 @@
           <w:sz w:val="28"/>
           <w:szCs w:val="28"/>
         </w:rPr>
-        <w:lastRenderedPageBreak/>
         <w:t xml:space="preserve">Рисунок </w:t>
       </w:r>
       <w:r>
@@ -11004,25 +10491,7 @@
           <w:sz w:val="28"/>
           <w:szCs w:val="28"/>
         </w:rPr>
-        <w:t>момента на валу</w:t>
-      </w:r>
-      <w:r>
-        <w:rPr>
-          <w:rFonts w:ascii="Times New Roman" w:hAnsi="Times New Roman" w:cs="Times New Roman"/>
-          <w:bCs/>
-          <w:sz w:val="28"/>
-          <w:szCs w:val="28"/>
-        </w:rPr>
-        <w:t xml:space="preserve">, </w:t>
-      </w:r>
-      <w:r>
-        <w:rPr>
-          <w:rFonts w:ascii="Times New Roman" w:hAnsi="Times New Roman" w:cs="Times New Roman"/>
-          <w:bCs/>
-          <w:sz w:val="28"/>
-          <w:szCs w:val="28"/>
-        </w:rPr>
-        <w:t>скорости вращения и угла поворота вала двигателя при 10 В на входе</w:t>
+        <w:t>момента на валу двигателя при 10 В на входе</w:t>
       </w:r>
       <w:r>
         <w:rPr>
@@ -11121,6 +10590,7 @@
           <w:sz w:val="28"/>
           <w:szCs w:val="28"/>
         </w:rPr>
+        <w:lastRenderedPageBreak/>
         <w:t xml:space="preserve"> </w:t>
       </w:r>
     </w:p>
@@ -11140,10 +10610,10 @@
           <w:noProof/>
         </w:rPr>
         <w:drawing>
-          <wp:inline distT="0" distB="0" distL="0" distR="0" wp14:anchorId="34DC7243" wp14:editId="6E241E3B">
-            <wp:extent cx="5574030" cy="5438761"/>
-            <wp:effectExtent l="0" t="0" r="7620" b="0"/>
-            <wp:docPr id="129772471" name="Рисунок 1"/>
+          <wp:inline distT="0" distB="0" distL="0" distR="0" wp14:anchorId="54935FA4" wp14:editId="28FE0A20">
+            <wp:extent cx="5703570" cy="5588938"/>
+            <wp:effectExtent l="0" t="0" r="0" b="0"/>
+            <wp:docPr id="546804076" name="Рисунок 1"/>
             <wp:cNvGraphicFramePr>
               <a:graphicFrameLocks xmlns:a="http://schemas.openxmlformats.org/drawingml/2006/main" noChangeAspect="1"/>
             </wp:cNvGraphicFramePr>
@@ -11151,7 +10621,7 @@
               <a:graphicData uri="http://schemas.openxmlformats.org/drawingml/2006/picture">
                 <pic:pic xmlns:pic="http://schemas.openxmlformats.org/drawingml/2006/picture">
                   <pic:nvPicPr>
-                    <pic:cNvPr id="129772471" name=""/>
+                    <pic:cNvPr id="546804076" name=""/>
                     <pic:cNvPicPr/>
                   </pic:nvPicPr>
                   <pic:blipFill>
@@ -11163,7 +10633,7 @@
                   <pic:spPr>
                     <a:xfrm>
                       <a:off x="0" y="0"/>
-                      <a:ext cx="5576978" cy="5441637"/>
+                      <a:ext cx="5705633" cy="5590959"/>
                     </a:xfrm>
                     <a:prstGeom prst="rect">
                       <a:avLst/>
@@ -11185,7 +10655,6 @@
         <w:rPr>
           <w:rFonts w:ascii="Times New Roman" w:hAnsi="Times New Roman" w:cs="Times New Roman"/>
           <w:bCs/>
-          <w:i/>
           <w:sz w:val="28"/>
           <w:szCs w:val="28"/>
         </w:rPr>
@@ -11322,7 +10791,245 @@
     <w:p>
       <w:pPr>
         <w:spacing w:line="360" w:lineRule="auto"/>
+        <w:ind w:firstLine="709"/>
         <w:mirrorIndents/>
+        <w:jc w:val="both"/>
+        <w:rPr>
+          <w:rFonts w:ascii="Times New Roman" w:hAnsi="Times New Roman" w:cs="Times New Roman"/>
+          <w:bCs/>
+          <w:sz w:val="28"/>
+          <w:szCs w:val="28"/>
+        </w:rPr>
+      </w:pPr>
+      <w:r>
+        <w:rPr>
+          <w:rFonts w:ascii="Times New Roman" w:hAnsi="Times New Roman" w:cs="Times New Roman"/>
+          <w:bCs/>
+          <w:sz w:val="28"/>
+          <w:szCs w:val="28"/>
+        </w:rPr>
+        <w:t>Вообще график зависимости угла поворота вала двигателя от времени выглядит так:</w:t>
+      </w:r>
+    </w:p>
+    <w:p>
+      <w:pPr>
+        <w:spacing w:line="360" w:lineRule="auto"/>
+        <w:mirrorIndents/>
+        <w:jc w:val="center"/>
+        <w:rPr>
+          <w:rFonts w:ascii="Times New Roman" w:hAnsi="Times New Roman" w:cs="Times New Roman"/>
+          <w:bCs/>
+          <w:i/>
+          <w:sz w:val="28"/>
+          <w:szCs w:val="28"/>
+        </w:rPr>
+      </w:pPr>
+      <w:r>
+        <w:rPr>
+          <w:noProof/>
+        </w:rPr>
+        <w:lastRenderedPageBreak/>
+        <w:drawing>
+          <wp:inline distT="0" distB="0" distL="0" distR="0" wp14:anchorId="4743869F" wp14:editId="2EADEF40">
+            <wp:extent cx="5939790" cy="2776220"/>
+            <wp:effectExtent l="0" t="0" r="3810" b="5080"/>
+            <wp:docPr id="1988450212" name="Рисунок 1"/>
+            <wp:cNvGraphicFramePr>
+              <a:graphicFrameLocks xmlns:a="http://schemas.openxmlformats.org/drawingml/2006/main" noChangeAspect="1"/>
+            </wp:cNvGraphicFramePr>
+            <a:graphic xmlns:a="http://schemas.openxmlformats.org/drawingml/2006/main">
+              <a:graphicData uri="http://schemas.openxmlformats.org/drawingml/2006/picture">
+                <pic:pic xmlns:pic="http://schemas.openxmlformats.org/drawingml/2006/picture">
+                  <pic:nvPicPr>
+                    <pic:cNvPr id="1988450212" name=""/>
+                    <pic:cNvPicPr/>
+                  </pic:nvPicPr>
+                  <pic:blipFill>
+                    <a:blip r:embed="rId19"/>
+                    <a:stretch>
+                      <a:fillRect/>
+                    </a:stretch>
+                  </pic:blipFill>
+                  <pic:spPr>
+                    <a:xfrm>
+                      <a:off x="0" y="0"/>
+                      <a:ext cx="5939790" cy="2776220"/>
+                    </a:xfrm>
+                    <a:prstGeom prst="rect">
+                      <a:avLst/>
+                    </a:prstGeom>
+                  </pic:spPr>
+                </pic:pic>
+              </a:graphicData>
+            </a:graphic>
+          </wp:inline>
+        </w:drawing>
+      </w:r>
+    </w:p>
+    <w:p>
+      <w:pPr>
+        <w:spacing w:line="360" w:lineRule="auto"/>
+        <w:ind w:firstLine="709"/>
+        <w:mirrorIndents/>
+        <w:jc w:val="both"/>
+        <w:rPr>
+          <w:rFonts w:ascii="Times New Roman" w:hAnsi="Times New Roman" w:cs="Times New Roman"/>
+          <w:bCs/>
+          <w:sz w:val="28"/>
+          <w:szCs w:val="28"/>
+        </w:rPr>
+      </w:pPr>
+      <w:r>
+        <w:rPr>
+          <w:rFonts w:ascii="Times New Roman" w:hAnsi="Times New Roman" w:cs="Times New Roman"/>
+          <w:bCs/>
+          <w:sz w:val="28"/>
+          <w:szCs w:val="28"/>
+        </w:rPr>
+        <w:t xml:space="preserve">Рисунок </w:t>
+      </w:r>
+      <w:r>
+        <w:rPr>
+          <w:rFonts w:ascii="Times New Roman" w:hAnsi="Times New Roman" w:cs="Times New Roman"/>
+          <w:bCs/>
+          <w:sz w:val="28"/>
+          <w:szCs w:val="28"/>
+        </w:rPr>
+        <w:t>9</w:t>
+      </w:r>
+      <w:r>
+        <w:rPr>
+          <w:rFonts w:ascii="Times New Roman" w:hAnsi="Times New Roman" w:cs="Times New Roman"/>
+          <w:bCs/>
+          <w:sz w:val="28"/>
+          <w:szCs w:val="28"/>
+        </w:rPr>
+        <w:t xml:space="preserve"> – </w:t>
+      </w:r>
+      <w:r>
+        <w:rPr>
+          <w:rFonts w:ascii="Times New Roman" w:hAnsi="Times New Roman" w:cs="Times New Roman"/>
+          <w:bCs/>
+          <w:sz w:val="28"/>
+          <w:szCs w:val="28"/>
+        </w:rPr>
+        <w:t xml:space="preserve">Графики </w:t>
+      </w:r>
+      <w:r>
+        <w:rPr>
+          <w:rFonts w:ascii="Times New Roman" w:hAnsi="Times New Roman" w:cs="Times New Roman"/>
+          <w:bCs/>
+          <w:sz w:val="28"/>
+          <w:szCs w:val="28"/>
+        </w:rPr>
+        <w:t xml:space="preserve">зависимости угла от времени при большем времени моделирования </w:t>
+      </w:r>
+      <w:r>
+        <w:rPr>
+          <w:rFonts w:ascii="Times New Roman" w:hAnsi="Times New Roman" w:cs="Times New Roman"/>
+          <w:bCs/>
+          <w:sz w:val="28"/>
+          <w:szCs w:val="28"/>
+        </w:rPr>
+        <w:t>при 10 В на входе</w:t>
+      </w:r>
+      <w:r>
+        <w:rPr>
+          <w:rFonts w:ascii="Times New Roman" w:hAnsi="Times New Roman" w:cs="Times New Roman"/>
+          <w:bCs/>
+          <w:sz w:val="28"/>
+          <w:szCs w:val="28"/>
+        </w:rPr>
+        <w:t xml:space="preserve"> </w:t>
+      </w:r>
+      <w:r>
+        <w:rPr>
+          <w:rFonts w:ascii="Times New Roman" w:hAnsi="Times New Roman" w:cs="Times New Roman"/>
+          <w:bCs/>
+          <w:sz w:val="28"/>
+          <w:szCs w:val="28"/>
+        </w:rPr>
+        <w:t xml:space="preserve">и </w:t>
+      </w:r>
+      <w:r>
+        <w:rPr>
+          <w:rFonts w:ascii="Times New Roman" w:hAnsi="Times New Roman" w:cs="Times New Roman"/>
+          <w:bCs/>
+          <w:sz w:val="28"/>
+          <w:szCs w:val="28"/>
+        </w:rPr>
+        <w:t xml:space="preserve">при </w:t>
+      </w:r>
+      <m:oMath>
+        <m:r>
+          <w:rPr>
+            <w:rFonts w:ascii="Cambria Math" w:hAnsi="Cambria Math" w:cs="Times New Roman"/>
+            <w:sz w:val="28"/>
+            <w:szCs w:val="28"/>
+          </w:rPr>
+          <m:t>Мтр=</m:t>
+        </m:r>
+        <m:r>
+          <w:rPr>
+            <w:rFonts w:ascii="Cambria Math" w:hAnsi="Cambria Math" w:cs="Times New Roman"/>
+            <w:sz w:val="28"/>
+            <w:szCs w:val="28"/>
+            <w:lang w:val="en-US"/>
+          </w:rPr>
+          <m:t>β</m:t>
+        </m:r>
+        <m:r>
+          <w:rPr>
+            <w:rFonts w:ascii="Cambria Math" w:hAnsi="Cambria Math" w:cs="Times New Roman"/>
+            <w:sz w:val="28"/>
+            <w:szCs w:val="28"/>
+          </w:rPr>
+          <m:t>∙</m:t>
+        </m:r>
+        <m:acc>
+          <m:accPr>
+            <m:chr m:val="̇"/>
+            <m:ctrlPr>
+              <w:rPr>
+                <w:rFonts w:ascii="Cambria Math" w:hAnsi="Cambria Math" w:cs="Times New Roman"/>
+                <w:bCs/>
+                <w:i/>
+                <w:sz w:val="28"/>
+                <w:szCs w:val="28"/>
+              </w:rPr>
+            </m:ctrlPr>
+          </m:accPr>
+          <m:e>
+            <m:r>
+              <w:rPr>
+                <w:rFonts w:ascii="Cambria Math" w:hAnsi="Cambria Math" w:cs="Times New Roman"/>
+                <w:sz w:val="28"/>
+                <w:szCs w:val="28"/>
+              </w:rPr>
+              <m:t>φ</m:t>
+            </m:r>
+          </m:e>
+        </m:acc>
+      </m:oMath>
+    </w:p>
+    <w:p>
+      <w:pPr>
+        <w:spacing w:line="360" w:lineRule="auto"/>
+        <w:ind w:firstLine="709"/>
+        <w:mirrorIndents/>
+        <w:jc w:val="both"/>
+        <w:rPr>
+          <w:rFonts w:ascii="Times New Roman" w:hAnsi="Times New Roman" w:cs="Times New Roman"/>
+          <w:bCs/>
+          <w:sz w:val="28"/>
+          <w:szCs w:val="28"/>
+        </w:rPr>
+      </w:pPr>
+    </w:p>
+    <w:p>
+      <w:pPr>
+        <w:spacing w:line="360" w:lineRule="auto"/>
+        <w:mirrorIndents/>
         <w:rPr>
           <w:rFonts w:ascii="Times New Roman" w:hAnsi="Times New Roman" w:cs="Times New Roman"/>
           <w:bCs/>
@@ -11335,7 +11042,6 @@
         <w:rPr>
           <w:noProof/>
         </w:rPr>
-        <w:lastRenderedPageBreak/>
         <w:drawing>
           <wp:inline distT="0" distB="0" distL="0" distR="0" wp14:anchorId="1842D46A" wp14:editId="211EB4EB">
             <wp:extent cx="5939790" cy="2501265"/>
@@ -11352,7 +11058,7 @@
                     <pic:cNvPicPr/>
                   </pic:nvPicPr>
                   <pic:blipFill>
-                    <a:blip r:embed="rId19"/>
+                    <a:blip r:embed="rId20"/>
                     <a:stretch>
                       <a:fillRect/>
                     </a:stretch>
@@ -11670,6 +11376,7 @@
         <w:rPr>
           <w:noProof/>
         </w:rPr>
+        <w:lastRenderedPageBreak/>
         <w:drawing>
           <wp:inline distT="0" distB="0" distL="0" distR="0" wp14:anchorId="6CAD528E" wp14:editId="3D9290A3">
             <wp:extent cx="2387515" cy="2393950"/>
@@ -11686,7 +11393,7 @@
                     <pic:cNvPicPr/>
                   </pic:nvPicPr>
                   <pic:blipFill>
-                    <a:blip r:embed="rId20"/>
+                    <a:blip r:embed="rId21"/>
                     <a:stretch>
                       <a:fillRect/>
                     </a:stretch>
@@ -11852,7 +11559,6 @@
           <w:sz w:val="28"/>
           <w:szCs w:val="28"/>
         </w:rPr>
-        <w:lastRenderedPageBreak/>
         <w:t>КАК Я ВЁЛ СВЛЙ ПРОЕКТ НА ГИТ</w:t>
       </w:r>
     </w:p>
@@ -11916,7 +11622,6 @@
                 <w:szCs w:val="28"/>
               </w:rPr>
             </w:pPr>
-            <w:proofErr w:type="spellStart"/>
             <w:r>
               <w:rPr>
                 <w:rFonts w:ascii="Consolas" w:hAnsi="Consolas" w:cs="Times New Roman"/>
@@ -11924,37 +11629,7 @@
                 <w:sz w:val="28"/>
                 <w:szCs w:val="28"/>
               </w:rPr>
-              <w:t>git</w:t>
-            </w:r>
-            <w:proofErr w:type="spellEnd"/>
-            <w:r>
-              <w:rPr>
-                <w:rFonts w:ascii="Consolas" w:hAnsi="Consolas" w:cs="Times New Roman"/>
-                <w:bCs/>
-                <w:sz w:val="28"/>
-                <w:szCs w:val="28"/>
-              </w:rPr>
-              <w:t xml:space="preserve"> </w:t>
-            </w:r>
-            <w:proofErr w:type="spellStart"/>
-            <w:r>
-              <w:rPr>
-                <w:rFonts w:ascii="Consolas" w:hAnsi="Consolas" w:cs="Times New Roman"/>
-                <w:bCs/>
-                <w:sz w:val="28"/>
-                <w:szCs w:val="28"/>
-              </w:rPr>
-              <w:t>clone</w:t>
-            </w:r>
-            <w:proofErr w:type="spellEnd"/>
-            <w:r>
-              <w:rPr>
-                <w:rFonts w:ascii="Consolas" w:hAnsi="Consolas" w:cs="Times New Roman"/>
-                <w:bCs/>
-                <w:sz w:val="28"/>
-                <w:szCs w:val="28"/>
-              </w:rPr>
-              <w:t xml:space="preserve"> https://github.com/shoglin/DC_motor.git</w:t>
+              <w:t>git clone https://github.com/shoglin/DC_motor.git</w:t>
             </w:r>
           </w:p>
           <w:p>
@@ -12063,20 +11738,8 @@
                 <w:szCs w:val="28"/>
                 <w:lang w:val="en-US"/>
               </w:rPr>
-              <w:t>git checkout -b feature-</w:t>
+              <w:t>git checkout -b feature-viscous_friction</w:t>
             </w:r>
-            <w:proofErr w:type="spellStart"/>
-            <w:r>
-              <w:rPr>
-                <w:rFonts w:ascii="Consolas" w:hAnsi="Consolas" w:cs="Times New Roman"/>
-                <w:bCs/>
-                <w:sz w:val="28"/>
-                <w:szCs w:val="28"/>
-                <w:lang w:val="en-US"/>
-              </w:rPr>
-              <w:t>viscous_friction</w:t>
-            </w:r>
-            <w:proofErr w:type="spellEnd"/>
           </w:p>
           <w:p>
             <w:pPr>
@@ -12185,20 +11848,8 @@
                 <w:szCs w:val="28"/>
                 <w:lang w:val="en-US"/>
               </w:rPr>
-              <w:t>git merge feature-</w:t>
+              <w:t>git merge feature-viscous_friction</w:t>
             </w:r>
-            <w:proofErr w:type="spellStart"/>
-            <w:r>
-              <w:rPr>
-                <w:rFonts w:ascii="Consolas" w:hAnsi="Consolas" w:cs="Times New Roman"/>
-                <w:bCs/>
-                <w:sz w:val="28"/>
-                <w:szCs w:val="28"/>
-                <w:lang w:val="en-US"/>
-              </w:rPr>
-              <w:t>viscous_friction</w:t>
-            </w:r>
-            <w:proofErr w:type="spellEnd"/>
           </w:p>
           <w:p>
             <w:pPr>
@@ -12294,6 +11945,7 @@
                 <w:szCs w:val="28"/>
                 <w:lang w:val="en-US"/>
               </w:rPr>
+              <w:lastRenderedPageBreak/>
               <w:t>git push -u origin dev</w:t>
             </w:r>
           </w:p>
@@ -12317,20 +11969,8 @@
                 <w:szCs w:val="28"/>
                 <w:lang w:val="en-US"/>
               </w:rPr>
-              <w:t>git push -u origin feature-</w:t>
+              <w:t>git push -u origin feature-viscous_friction</w:t>
             </w:r>
-            <w:proofErr w:type="spellStart"/>
-            <w:r>
-              <w:rPr>
-                <w:rFonts w:ascii="Consolas" w:hAnsi="Consolas" w:cs="Times New Roman"/>
-                <w:bCs/>
-                <w:sz w:val="28"/>
-                <w:szCs w:val="28"/>
-                <w:lang w:val="en-US"/>
-              </w:rPr>
-              <w:t>viscous_friction</w:t>
-            </w:r>
-            <w:proofErr w:type="spellEnd"/>
           </w:p>
         </w:tc>
       </w:tr>
@@ -12403,47 +12043,7 @@
           <w:sz w:val="28"/>
           <w:szCs w:val="28"/>
         </w:rPr>
-        <w:t xml:space="preserve">оздан </w:t>
-      </w:r>
-      <w:proofErr w:type="spellStart"/>
-      <w:r>
-        <w:rPr>
-          <w:rFonts w:ascii="Times New Roman" w:hAnsi="Times New Roman" w:cs="Times New Roman"/>
-          <w:bCs/>
-          <w:sz w:val="28"/>
-          <w:szCs w:val="28"/>
-        </w:rPr>
-        <w:t>initial</w:t>
-      </w:r>
-      <w:proofErr w:type="spellEnd"/>
-      <w:r>
-        <w:rPr>
-          <w:rFonts w:ascii="Times New Roman" w:hAnsi="Times New Roman" w:cs="Times New Roman"/>
-          <w:bCs/>
-          <w:sz w:val="28"/>
-          <w:szCs w:val="28"/>
-        </w:rPr>
-        <w:t xml:space="preserve"> </w:t>
-      </w:r>
-      <w:proofErr w:type="spellStart"/>
-      <w:r>
-        <w:rPr>
-          <w:rFonts w:ascii="Times New Roman" w:hAnsi="Times New Roman" w:cs="Times New Roman"/>
-          <w:bCs/>
-          <w:sz w:val="28"/>
-          <w:szCs w:val="28"/>
-        </w:rPr>
-        <w:t>commit</w:t>
-      </w:r>
-      <w:proofErr w:type="spellEnd"/>
-      <w:r>
-        <w:rPr>
-          <w:rFonts w:ascii="Times New Roman" w:hAnsi="Times New Roman" w:cs="Times New Roman"/>
-          <w:bCs/>
-          <w:sz w:val="28"/>
-          <w:szCs w:val="28"/>
-        </w:rPr>
-        <w:t xml:space="preserve"> с базовой структурой проекта</w:t>
+        <w:t>оздан initial commit с базовой структурой проекта</w:t>
       </w:r>
     </w:p>
     <w:p>
@@ -12470,19 +12070,8 @@
           <w:sz w:val="28"/>
           <w:szCs w:val="28"/>
         </w:rPr>
-        <w:t xml:space="preserve">Выполнены пункты 1 и 2 (модель без трения) → коммит в </w:t>
-      </w:r>
-      <w:proofErr w:type="spellStart"/>
-      <w:r>
-        <w:rPr>
-          <w:rFonts w:ascii="Times New Roman" w:hAnsi="Times New Roman" w:cs="Times New Roman"/>
-          <w:bCs/>
-          <w:sz w:val="28"/>
-          <w:szCs w:val="28"/>
-        </w:rPr>
-        <w:t>dev</w:t>
-      </w:r>
-      <w:proofErr w:type="spellEnd"/>
+        <w:t>Выполнены пункты 1 и 2 (модель без трения) → коммит в dev</w:t>
+      </w:r>
     </w:p>
     <w:p>
       <w:pPr>
@@ -12538,29 +12127,7 @@
           <w:szCs w:val="28"/>
           <w:lang w:val="en-US"/>
         </w:rPr>
-        <w:t xml:space="preserve"> feature-</w:t>
-      </w:r>
-      <w:proofErr w:type="spellStart"/>
-      <w:r>
-        <w:rPr>
-          <w:rFonts w:ascii="Times New Roman" w:hAnsi="Times New Roman" w:cs="Times New Roman"/>
-          <w:bCs/>
-          <w:sz w:val="28"/>
-          <w:szCs w:val="28"/>
-          <w:lang w:val="en-US"/>
-        </w:rPr>
-        <w:t>viscous_friction</w:t>
-      </w:r>
-      <w:proofErr w:type="spellEnd"/>
-      <w:r>
-        <w:rPr>
-          <w:rFonts w:ascii="Times New Roman" w:hAnsi="Times New Roman" w:cs="Times New Roman"/>
-          <w:bCs/>
-          <w:sz w:val="28"/>
-          <w:szCs w:val="28"/>
-          <w:lang w:val="en-US"/>
-        </w:rPr>
-        <w:t xml:space="preserve"> </w:t>
+        <w:t xml:space="preserve"> feature-viscous_friction </w:t>
       </w:r>
       <w:r>
         <w:rPr>
@@ -12712,20 +12279,8 @@
           <w:szCs w:val="28"/>
           <w:lang w:val="en-US"/>
         </w:rPr>
-        <w:t xml:space="preserve"> feature-</w:t>
-      </w:r>
-      <w:proofErr w:type="spellStart"/>
-      <w:r>
-        <w:rPr>
-          <w:rFonts w:ascii="Times New Roman" w:hAnsi="Times New Roman" w:cs="Times New Roman"/>
-          <w:bCs/>
-          <w:sz w:val="28"/>
-          <w:szCs w:val="28"/>
-          <w:lang w:val="en-US"/>
-        </w:rPr>
-        <w:t>viscous_friction</w:t>
-      </w:r>
-      <w:proofErr w:type="spellEnd"/>
+        <w:t xml:space="preserve"> feature-viscous_friction</w:t>
+      </w:r>
     </w:p>
     <w:p>
       <w:pPr>
@@ -12751,19 +12306,8 @@
           <w:sz w:val="28"/>
           <w:szCs w:val="28"/>
         </w:rPr>
-        <w:t xml:space="preserve">Изменения слиты в ветку </w:t>
-      </w:r>
-      <w:proofErr w:type="spellStart"/>
-      <w:r>
-        <w:rPr>
-          <w:rFonts w:ascii="Times New Roman" w:hAnsi="Times New Roman" w:cs="Times New Roman"/>
-          <w:bCs/>
-          <w:sz w:val="28"/>
-          <w:szCs w:val="28"/>
-        </w:rPr>
-        <w:t>dev</w:t>
-      </w:r>
-      <w:proofErr w:type="spellEnd"/>
+        <w:t>Изменения слиты в ветку dev</w:t>
+      </w:r>
     </w:p>
     <w:p>
       <w:pPr>
@@ -12865,39 +12409,8 @@
           <w:sz w:val="28"/>
           <w:szCs w:val="28"/>
         </w:rPr>
-        <w:t xml:space="preserve">Pull </w:t>
-      </w:r>
-      <w:proofErr w:type="spellStart"/>
-      <w:r>
-        <w:rPr>
-          <w:rFonts w:ascii="Times New Roman" w:hAnsi="Times New Roman" w:cs="Times New Roman"/>
-          <w:bCs/>
-          <w:sz w:val="28"/>
-          <w:szCs w:val="28"/>
-        </w:rPr>
-        <w:t>Request</w:t>
-      </w:r>
-      <w:proofErr w:type="spellEnd"/>
-      <w:r>
-        <w:rPr>
-          <w:rFonts w:ascii="Times New Roman" w:hAnsi="Times New Roman" w:cs="Times New Roman"/>
-          <w:bCs/>
-          <w:sz w:val="28"/>
-          <w:szCs w:val="28"/>
-        </w:rPr>
-        <w:t xml:space="preserve"> одобрен и выполнен </w:t>
-      </w:r>
-      <w:proofErr w:type="spellStart"/>
-      <w:r>
-        <w:rPr>
-          <w:rFonts w:ascii="Times New Roman" w:hAnsi="Times New Roman" w:cs="Times New Roman"/>
-          <w:bCs/>
-          <w:sz w:val="28"/>
-          <w:szCs w:val="28"/>
-        </w:rPr>
-        <w:t>merge</w:t>
-      </w:r>
-      <w:proofErr w:type="spellEnd"/>
+        <w:t>Pull Request одобрен и выполнен merge</w:t>
+      </w:r>
     </w:p>
     <w:p>
       <w:pPr>
@@ -12956,7 +12469,7 @@
         </w:rPr>
         <w:t xml:space="preserve">: </w:t>
       </w:r>
-      <w:hyperlink r:id="rId21" w:history="1">
+      <w:hyperlink r:id="rId22" w:history="1">
         <w:r>
           <w:rPr>
             <w:rStyle w:val="af1"/>
@@ -12970,7 +12483,7 @@
       </w:hyperlink>
     </w:p>
     <w:sectPr>
-      <w:footerReference w:type="default" r:id="rId22"/>
+      <w:footerReference w:type="default" r:id="rId23"/>
       <w:pgSz w:w="11906" w:h="16838" w:code="9"/>
       <w:pgMar w:top="1134" w:right="851" w:bottom="1134" w:left="1701" w:header="709" w:footer="709" w:gutter="0"/>
       <w:cols w:space="708"/>
@@ -14266,6 +13779,7 @@
   <w:style w:type="character" w:default="1" w:styleId="a0">
     <w:name w:val="Default Paragraph Font"/>
     <w:uiPriority w:val="1"/>
+    <w:semiHidden/>
     <w:unhideWhenUsed/>
   </w:style>
   <w:style w:type="table" w:default="1" w:styleId="a1">

</xml_diff>